<commit_message>
docs: alinear perfil con proyección a bonos de carbono
</commit_message>
<xml_diff>
--- a/documentacion-grado/06_entregables/perfil/Perfil_Proyecto_de_Grado_R3Foresta.docx
+++ b/documentacion-grado/06_entregables/perfil/Perfil_Proyecto_de_Grado_R3Foresta.docx
@@ -257,7 +257,7 @@
           <w:rFonts w:ascii="Times New Roman" w:hAnsi="Times New Roman"/>
           <w:sz w:val="24"/>
         </w:rPr>
-        <w:t>R3Foresta es una organización que desarrolla actividades de reforestación con la participación de comunidades, voluntarios y empresas patrocinadoras. En estas actividades, las semillas recolectadas atraviesan procesos de vivero hasta convertirse en plantas destinadas a la plantación. En la práctica actual, fotografías, mensajes, publicaciones en redes sociales, cuadernos y otros registros documentan parcialmente estos procesos, pero la información no se conserva bajo una estructura común que permita relacionar procedencia, cantidades, responsables, ubicaciones y evidencias entre las diferentes etapas. Esta fragmentación dificulta reconstruir el recorrido de las semillas y plantas y presentar información consistente a los actores interesados.</w:t>
+        <w:t>La Fundación R3Foresta para la Bioregeneración de Ecosistemas y la Economía Circular desarrolla actividades de reforestación con la participación de comunidades, voluntarios y empresas patrocinadoras. En estas actividades, las semillas recolectadas atraviesan procesos de vivero hasta convertirse en plantas destinadas a la plantación. En la práctica actual, fotografías, mensajes, publicaciones en redes sociales, cuadernos y otros registros documentan parcialmente estos procesos, pero la información no se conserva bajo una estructura común que permita relacionar procedencia, cantidades, responsables, ubicaciones y evidencias entre las diferentes etapas. Esta fragmentación dificulta reconstruir el recorrido de las semillas y plantas y presentar información consistente a los actores interesados.</w:t>
       </w:r>
     </w:p>
     <w:p>
@@ -370,7 +370,7 @@
           <w:rFonts w:ascii="Times New Roman" w:hAnsi="Times New Roman"/>
           <w:sz w:val="22"/>
         </w:rPr>
-        <w:t>3</w:t>
+        <w:t>2</w:t>
       </w:r>
     </w:p>
     <w:p>
@@ -474,7 +474,7 @@
           <w:rFonts w:ascii="Times New Roman" w:hAnsi="Times New Roman"/>
           <w:sz w:val="22"/>
         </w:rPr>
-        <w:t>13</w:t>
+        <w:t>12</w:t>
       </w:r>
     </w:p>
     <w:p>
@@ -500,7 +500,7 @@
           <w:rFonts w:ascii="Times New Roman" w:hAnsi="Times New Roman"/>
           <w:sz w:val="22"/>
         </w:rPr>
-        <w:t>17</w:t>
+        <w:t>15</w:t>
       </w:r>
     </w:p>
     <w:p>
@@ -526,7 +526,7 @@
           <w:rFonts w:ascii="Times New Roman" w:hAnsi="Times New Roman"/>
           <w:sz w:val="22"/>
         </w:rPr>
-        <w:t>20</w:t>
+        <w:t>18</w:t>
       </w:r>
     </w:p>
     <w:p>
@@ -552,7 +552,7 @@
           <w:rFonts w:ascii="Times New Roman" w:hAnsi="Times New Roman"/>
           <w:sz w:val="22"/>
         </w:rPr>
-        <w:t>24</w:t>
+        <w:t>22</w:t>
       </w:r>
     </w:p>
     <w:p>
@@ -578,7 +578,7 @@
           <w:rFonts w:ascii="Times New Roman" w:hAnsi="Times New Roman"/>
           <w:sz w:val="22"/>
         </w:rPr>
-        <w:t>27</w:t>
+        <w:t>24</w:t>
       </w:r>
     </w:p>
     <w:p>
@@ -604,7 +604,7 @@
           <w:rFonts w:ascii="Times New Roman" w:hAnsi="Times New Roman"/>
           <w:sz w:val="22"/>
         </w:rPr>
-        <w:t>29</w:t>
+        <w:t>25</w:t>
       </w:r>
     </w:p>
     <w:p>
@@ -620,7 +620,7 @@
           <w:rFonts w:ascii="Times New Roman" w:hAnsi="Times New Roman"/>
           <w:sz w:val="22"/>
         </w:rPr>
-        <w:t>12. Recursos y presupuesto</w:t>
+        <w:t>12. Recursos</w:t>
       </w:r>
       <w:r>
         <w:tab/>
@@ -630,7 +630,7 @@
           <w:rFonts w:ascii="Times New Roman" w:hAnsi="Times New Roman"/>
           <w:sz w:val="22"/>
         </w:rPr>
-        <w:t>31</w:t>
+        <w:t>26</w:t>
       </w:r>
     </w:p>
     <w:p>
@@ -656,7 +656,7 @@
           <w:rFonts w:ascii="Times New Roman" w:hAnsi="Times New Roman"/>
           <w:sz w:val="22"/>
         </w:rPr>
-        <w:t>33</w:t>
+        <w:t>27</w:t>
       </w:r>
     </w:p>
     <w:p>
@@ -682,7 +682,7 @@
           <w:rFonts w:ascii="Times New Roman" w:hAnsi="Times New Roman"/>
           <w:sz w:val="22"/>
         </w:rPr>
-        <w:t>37</w:t>
+        <w:t>30</w:t>
       </w:r>
     </w:p>
     <w:p>
@@ -724,7 +724,7 @@
           <w:rFonts w:ascii="Times New Roman" w:hAnsi="Times New Roman"/>
           <w:sz w:val="22"/>
         </w:rPr>
-        <w:t>14</w:t>
+        <w:t>13</w:t>
       </w:r>
     </w:p>
     <w:p>
@@ -750,7 +750,7 @@
           <w:rFonts w:ascii="Times New Roman" w:hAnsi="Times New Roman"/>
           <w:sz w:val="22"/>
         </w:rPr>
-        <w:t>22</w:t>
+        <w:t>20</w:t>
       </w:r>
     </w:p>
     <w:p>
@@ -776,7 +776,7 @@
           <w:rFonts w:ascii="Times New Roman" w:hAnsi="Times New Roman"/>
           <w:sz w:val="22"/>
         </w:rPr>
-        <w:t>28</w:t>
+        <w:t>25</w:t>
       </w:r>
     </w:p>
     <w:p>
@@ -802,7 +802,22 @@
           <w:rFonts w:ascii="Times New Roman" w:hAnsi="Times New Roman"/>
           <w:sz w:val="22"/>
         </w:rPr>
-        <w:t>29</w:t>
+        <w:t>25</w:t>
+      </w:r>
+    </w:p>
+    <w:p>
+      <w:pPr>
+        <w:spacing w:before="320" w:after="200"/>
+        <w:ind w:firstLine="0"/>
+        <w:jc w:val="center"/>
+      </w:pPr>
+      <w:r>
+        <w:rPr>
+          <w:rFonts w:ascii="Times New Roman" w:hAnsi="Times New Roman"/>
+          <w:b/>
+          <w:sz w:val="28"/>
+        </w:rPr>
+        <w:t>Índice de figuras</w:t>
       </w:r>
     </w:p>
     <w:p>
@@ -818,7 +833,7 @@
           <w:rFonts w:ascii="Times New Roman" w:hAnsi="Times New Roman"/>
           <w:sz w:val="22"/>
         </w:rPr>
-        <w:t>Tabla 5. Presupuesto monetario previsto.</w:t>
+        <w:t>Figura 1. Estructura organizacional de R3Foresta.</w:t>
       </w:r>
       <w:r>
         <w:tab/>
@@ -828,22 +843,7 @@
           <w:rFonts w:ascii="Times New Roman" w:hAnsi="Times New Roman"/>
           <w:sz w:val="22"/>
         </w:rPr>
-        <w:t>31</w:t>
-      </w:r>
-    </w:p>
-    <w:p>
-      <w:pPr>
-        <w:spacing w:before="320" w:after="200"/>
-        <w:ind w:firstLine="0"/>
-        <w:jc w:val="center"/>
-      </w:pPr>
-      <w:r>
-        <w:rPr>
-          <w:rFonts w:ascii="Times New Roman" w:hAnsi="Times New Roman"/>
-          <w:b/>
-          <w:sz w:val="28"/>
-        </w:rPr>
-        <w:t>Índice de figuras</w:t>
+        <w:t>3</w:t>
       </w:r>
     </w:p>
     <w:p>
@@ -859,7 +859,7 @@
           <w:rFonts w:ascii="Times New Roman" w:hAnsi="Times New Roman"/>
           <w:sz w:val="22"/>
         </w:rPr>
-        <w:t>Figura 1. Árbol de causas y efectos.</w:t>
+        <w:t>Figura 2. Árbol de causas y efectos.</w:t>
       </w:r>
       <w:r>
         <w:tab/>
@@ -885,7 +885,7 @@
           <w:rFonts w:ascii="Times New Roman" w:hAnsi="Times New Roman"/>
           <w:sz w:val="22"/>
         </w:rPr>
-        <w:t>Figura 2. Recorrido principal del material vegetal.</w:t>
+        <w:t>Figura 3. Recorrido principal del material vegetal.</w:t>
       </w:r>
       <w:r>
         <w:tab/>
@@ -895,7 +895,7 @@
           <w:rFonts w:ascii="Times New Roman" w:hAnsi="Times New Roman"/>
           <w:sz w:val="22"/>
         </w:rPr>
-        <w:t>24</w:t>
+        <w:t>22</w:t>
       </w:r>
     </w:p>
     <w:p>
@@ -911,7 +911,7 @@
           <w:rFonts w:ascii="Times New Roman" w:hAnsi="Times New Roman"/>
           <w:sz w:val="22"/>
         </w:rPr>
-        <w:t>Figura 3. Relación entre eventos, reglas de consistencia y reconstrucción.</w:t>
+        <w:t>Figura 4. Relación entre eventos, reglas de consistencia y reconstrucción.</w:t>
       </w:r>
       <w:r>
         <w:tab/>
@@ -921,7 +921,7 @@
           <w:rFonts w:ascii="Times New Roman" w:hAnsi="Times New Roman"/>
           <w:sz w:val="22"/>
         </w:rPr>
-        <w:t>25</w:t>
+        <w:t>23</w:t>
       </w:r>
     </w:p>
     <w:p>
@@ -937,7 +937,7 @@
           <w:rFonts w:ascii="Times New Roman" w:hAnsi="Times New Roman"/>
           <w:sz w:val="22"/>
         </w:rPr>
-        <w:t>Figura 4. Diagrama de Gantt, agosto–noviembre de 2026.</w:t>
+        <w:t>Figura 5. Diagrama de Gantt, agosto–noviembre de 2026.</w:t>
       </w:r>
       <w:r>
         <w:tab/>
@@ -947,7 +947,7 @@
           <w:rFonts w:ascii="Times New Roman" w:hAnsi="Times New Roman"/>
           <w:sz w:val="22"/>
         </w:rPr>
-        <w:t>30</w:t>
+        <w:t>26</w:t>
       </w:r>
     </w:p>
     <w:p>
@@ -966,7 +966,6 @@
     <w:p>
       <w:pPr>
         <w:pStyle w:val="Heading1"/>
-        <w:pageBreakBefore w:val="0"/>
       </w:pPr>
       <w:r>
         <w:rPr>
@@ -982,7 +981,7 @@
           <w:rFonts w:ascii="Times New Roman" w:hAnsi="Times New Roman"/>
           <w:sz w:val="24"/>
         </w:rPr>
-        <w:t xml:space="preserve">La reforestación comprende un conjunto de etapas sucesivas en las que las semillas, hasta convertirse en plantas, pasan por distintos procesos, ubicaciones y responsables antes de llegar a su plantación. En este recorrido, el material es recolectado, germinado, trasladado por diferentes actores y posteriormente destinado a ser plantado. Cada etapa genera información relacionada con su procedencia, cantidades, responsables, tiempos, ubicaciones y evidencias, cuya continuidad permite conocer cómo el material vegetal avanza a través del proceso. En adelante, se utilizará </w:t>
+        <w:t xml:space="preserve">La reforestación moviliza material vegetal entre lugares, responsables y etapas con propósitos distintos. Una semilla o unidad de propagación puede ser recolectada, trasladada al vivero, atravesar procesos biológicos, integrarse en lotes de plantas y finalmente ser asignada a una actividad de plantación. R3Foresta también utiliza material vegetal adquirido o recibido de terceros, que puede ingresar al vivero o dirigirse directamente a una plantación. En cualquiera de estos recorridos es necesario conservar la relación entre procedencia, cantidades, responsables, fechas, ubicaciones y evidencias. En adelante, se utilizará </w:t>
       </w:r>
       <w:r>
         <w:rPr>
@@ -1006,7 +1005,7 @@
           <w:rFonts w:ascii="Times New Roman" w:hAnsi="Times New Roman"/>
           <w:sz w:val="24"/>
         </w:rPr>
-        <w:t>La necesidad de mantener esta continuidad de información da lugar al concepto de trazabilidad. Esta no consiste únicamente en almacenar inventarios, registros o fotografías de forma aislada, sino en conservar la información y las relaciones necesarias para reconstruir el recorrido de un elemento a través de las distintas etapas de una cadena. Olsen y Borit (2013) la relacionan con la capacidad de acceder a información sobre un objeto a lo largo de su ciclo de vida.</w:t>
+        <w:t>La trazabilidad no consiste únicamente en almacenar inventarios, registros o fotografías de forma aislada, sino en conservar la información y las relaciones necesarias para reconstruir el recorrido de un elemento a través de las distintas etapas de una cadena. Olsen y Borit (2013) la relacionan con la capacidad de acceder a información sobre un objeto a lo largo de su ciclo de vida. En una cadena de custodia, además, los movimientos y cambios deben registrarse bajo reglas explícitas; sin embargo, la existencia de un sistema no verifica por sí sola la veracidad de las declaraciones de sus usuarios (International Organization for Standardization [ISO], 2020). Por ello, este proyecto plantea una trazabilidad reconstruible mediante evidencia contrastable y no una certificación independiente.</w:t>
       </w:r>
     </w:p>
     <w:p>
@@ -1015,7 +1014,22 @@
           <w:rFonts w:ascii="Times New Roman" w:hAnsi="Times New Roman"/>
           <w:sz w:val="24"/>
         </w:rPr>
-        <w:t>Asimismo, en una cadena de custodia deben registrarse los movimientos y cambios bajo reglas explícitas; sin embargo, la existencia de un sistema no verifica por sí sola la veracidad de las declaraciones realizadas por sus usuarios (International Organization for Standardization [ISO], 2020). Por esta razón, el presente trabajo plantea una trazabilidad reconstruible mediante evidencia contrastable, sin pretender constituirse en una certificación independiente.</w:t>
+        <w:t xml:space="preserve">El caso de estudio corresponde a la </w:t>
+      </w:r>
+      <w:r>
+        <w:rPr>
+          <w:rFonts w:ascii="Times New Roman" w:hAnsi="Times New Roman"/>
+          <w:b/>
+          <w:sz w:val="24"/>
+        </w:rPr>
+        <w:t>Fundación R3Foresta para la Bioregeneración de Ecosistemas y la Economía Circular</w:t>
+      </w:r>
+      <w:r>
+        <w:rPr>
+          <w:rFonts w:ascii="Times New Roman" w:hAnsi="Times New Roman"/>
+          <w:sz w:val="24"/>
+        </w:rPr>
+        <w:t>, que desarrolla actividades de reforestación con comunidades, voluntarios y organizaciones patrocinadoras. Actualmente, la información y las evidencias de estas actividades se conservan en fotografías, publicaciones en redes sociales, conversaciones de mensajería, cuadernos, notas y el conocimiento de las personas involucradas. Aunque estos registros documentan las actividades realizadas, se encuentran dispersos y no comparten una estructura, identificadores ni relaciones comunes que permitan reconstruir de extremo a extremo la procedencia y el recorrido del material vegetal, conciliar cantidades y saldos, identificar responsables y recuperar la evidencia asociada. Esta fragmentación limita la gestión interna y la capacidad de respaldar la información comunicada a patrocinadores y aliados.</w:t>
       </w:r>
     </w:p>
     <w:p>
@@ -1024,7 +1038,37 @@
           <w:rFonts w:ascii="Times New Roman" w:hAnsi="Times New Roman"/>
           <w:sz w:val="24"/>
         </w:rPr>
-        <w:t>La práctica actual de R3Foresta conserva información y evidencias de sus actividades mediante fotografías, redes sociales, servicios de mensajería, cuadernos y el conocimiento de los responsables. Sin embargo, estos registros se encuentran dispersos y no necesariamente comparten identificadores, unidades o reglas que permitan relacionarlos y conciliar las cantidades registradas entre las diferentes etapas. Esta situación afecta tanto la gestión interna como la información proporcionada a las empresas patrocinadoras, que requieren conocer cuántos árboles fueron destinados a una plantación, dónde fueron plantados y qué evidencias respaldan su ejecución. En este contexto, disponer de una trazabilidad reconstruible y respaldada por evidencia adquiere relevancia tanto para la gestión de dichos procesos como para sustentar la información comunicada a terceros.</w:t>
+        <w:t xml:space="preserve">Ante esta situación, el proyecto propone desarrollar y evaluar un sistema de trazabilidad como componente operativo de </w:t>
+      </w:r>
+      <w:r>
+        <w:rPr>
+          <w:rFonts w:ascii="Times New Roman" w:hAnsi="Times New Roman"/>
+          <w:b/>
+          <w:sz w:val="24"/>
+        </w:rPr>
+        <w:t>R3foresta App</w:t>
+      </w:r>
+      <w:r>
+        <w:rPr>
+          <w:rFonts w:ascii="Times New Roman" w:hAnsi="Times New Roman"/>
+          <w:sz w:val="24"/>
+        </w:rPr>
+        <w:t xml:space="preserve">, desde la recolección o recepción externa del material vegetal hasta el registro de su plantación. La solución integrará los módulos de </w:t>
+      </w:r>
+      <w:r>
+        <w:rPr>
+          <w:rFonts w:ascii="Times New Roman" w:hAnsi="Times New Roman"/>
+          <w:i/>
+          <w:sz w:val="24"/>
+        </w:rPr>
+        <w:t>Recolección, Vivero y Plantación</w:t>
+      </w:r>
+      <w:r>
+        <w:rPr>
+          <w:rFonts w:ascii="Times New Roman" w:hAnsi="Times New Roman"/>
+          <w:sz w:val="24"/>
+        </w:rPr>
+        <w:t>; el material adquirido o recibido de terceros se tratará como una variante de ingreso dentro de estos módulos y conservará sus datos de procedencia. Mediante el registro relacionado de eventos, movimientos, cantidades, responsables, ubicaciones y evidencias, la aplicación permitirá reconstruir la cadena de custodia y constituirá una base para la gestión y la rendición de cuentas de la Fundación.</w:t>
       </w:r>
     </w:p>
     <w:p>
@@ -1033,52 +1077,40 @@
           <w:rFonts w:ascii="Times New Roman" w:hAnsi="Times New Roman"/>
           <w:sz w:val="24"/>
         </w:rPr>
-        <w:t xml:space="preserve">Ante esta situación, el proyecto propone desarrollar y evaluar un sistema de trazabilidad que integre los procesos de </w:t>
-      </w:r>
-      <w:r>
-        <w:rPr>
-          <w:rFonts w:ascii="Times New Roman" w:hAnsi="Times New Roman"/>
-          <w:i/>
-          <w:sz w:val="24"/>
-        </w:rPr>
-        <w:t>recolección, vivero y plantación</w:t>
-      </w:r>
-      <w:r>
-        <w:rPr>
-          <w:rFonts w:ascii="Times New Roman" w:hAnsi="Times New Roman"/>
-          <w:sz w:val="24"/>
-        </w:rPr>
-        <w:t>. El sistema permitirá registrar los eventos y cambios que atraviesa el material vegetal desde su origen o ingreso al proceso hasta su plantación, vinculando información sobre cantidades, responsables, tiempos, ubicaciones y evidencias. A partir de estos registros, será posible reconstruir su recorrido a través de las distintas etapas y contrastar la información asociada a cada una de ellas. El alcance concluye con el registro de la plantación y no incluye el monitoreo posterior de los árboles. De esta manera, el sistema busca proporcionar una base estructurada para la gestión interna de R3Foresta y para respaldar la información comunicada a terceros.</w:t>
+        <w:t>El aporte de ingeniería comprende el análisis de los procesos y reglas de negocio, el diseño de un modelo de trazabilidad e integridad, la implementación integrada de los tres módulos y la verificación de los requerimientos y de las invariantes de consistencia. La evaluación comparará la solución con la práctica actual de R3Foresta en cuanto a capacidad de reconstrucción con evidencia contrastable y carga operativa, diferenciando la verificación técnica del software de su evaluación en el contexto institucional.</w:t>
       </w:r>
     </w:p>
     <w:p>
-      <w:pPr>
-        <w:pStyle w:val="Heading1"/>
-      </w:pPr>
-      <w:r>
-        <w:rPr>
-          <w:rFonts w:ascii="Times New Roman" w:hAnsi="Times New Roman"/>
-          <w:sz w:val="28"/>
-        </w:rPr>
-        <w:t>2. Antecedentes</w:t>
+      <w:r>
+        <w:rPr>
+          <w:rFonts w:ascii="Times New Roman" w:hAnsi="Times New Roman"/>
+          <w:sz w:val="24"/>
+        </w:rPr>
+        <w:t>El alcance concluye con el registro de la plantación. El sistema proporciona la base informacional de la cadena de custodia, pero no realiza monitoreo posterior de supervivencia, no mide captura de CO2, no implementa una metodología de monitoreo, reporte y verificación de carbono, no certifica plantaciones y no genera créditos de carbono.</w:t>
       </w:r>
     </w:p>
     <w:p>
-      <w:r>
-        <w:rPr>
-          <w:rFonts w:ascii="Times New Roman" w:hAnsi="Times New Roman"/>
-          <w:sz w:val="24"/>
-        </w:rPr>
-        <w:t>La revisión de antecedentes avanza desde las experiencias más cercanas al ámbito forestal boliviano hacia los fundamentos y mecanismos de trazabilidad aplicables al problema de R3Foresta.</w:t>
+      <w:pPr>
+        <w:pStyle w:val="Heading1"/>
+      </w:pPr>
+      <w:r>
+        <w:rPr>
+          <w:rFonts w:ascii="Times New Roman" w:hAnsi="Times New Roman"/>
+          <w:sz w:val="28"/>
+        </w:rPr>
+        <w:t>2. Antecedentes</w:t>
       </w:r>
     </w:p>
     <w:p>
+      <w:pPr>
+        <w:pStyle w:val="Heading2"/>
+      </w:pPr>
       <w:r>
         <w:rPr>
           <w:rFonts w:ascii="Times New Roman" w:hAnsi="Times New Roman"/>
           <w:sz w:val="24"/>
         </w:rPr>
-        <w:t>En Bolivia, Limachi Mamani (2020) desarrolló un sistema de registro y geolocalización de viveros para la Autoridad de Fiscalización y Control Social de Bosques y Tierra. El trabajo administra viveros, especies y volúmenes de producción, y demuestra la pertinencia de emplear sistemas georreferenciados en la gestión forestal del país. Su unidad principal de registro, sin embargo, es el vivero; por ello, el aporte se concentra en identificar y localizar unidades productivas y no en reconstruir el recorrido del material vegetal desde su procedencia hasta la plantación.</w:t>
+        <w:t>2.1. Antecedentes institucionales</w:t>
       </w:r>
     </w:p>
     <w:p>
@@ -1087,136 +1119,10 @@
           <w:rFonts w:ascii="Times New Roman" w:hAnsi="Times New Roman"/>
           <w:sz w:val="24"/>
         </w:rPr>
-        <w:t>La digitalización de viveros ha avanzado también en el contexto latinoamericano. Salamanca Contreras (2024) implementó un sistema web para el control interno y el inventario de un vivero comercial y reportó mejoras en la exactitud del inventario y el cumplimiento de despachos. Mayorga Vásquez et al. (2022), por su parte, propusieron un sistema web para procesos administrativos y productivos de viveros. Estos trabajos muestran que existencias, producción y despachos pueden gestionarse digitalmente, pero permanecen centrados en la administración interna del vivero: no relacionan de extremo a extremo la procedencia del material vegetal, sus transferencias hacia actividades de reforestación y la evidencia geográfica de la plantación.</w:t>
+        <w:t>R3Foresta fue creada en 2019 como una iniciativa y plataforma de acción socioambiental orientada a la bioregeneración de ecosistemas estratégicos y al fortalecimiento de las comunidades vinculadas con ellos. Su modelo evolucionó desde la acción ambiental directa hacia la integración de reforestación, agua, biodiversidad, residuos, alimentación, tecnología y comunidades. Actualmente articula las dimensiones ecológica, comunitaria, científico-tecnológica y económica mediante los componentes R3Carbon, R3Water, R3Bio y R3F10 — Reciclaje y Economía Circular (R3Foresta, 2026).</w:t>
       </w:r>
     </w:p>
     <w:p>
-      <w:r>
-        <w:rPr>
-          <w:rFonts w:ascii="Times New Roman" w:hAnsi="Times New Roman"/>
-          <w:sz w:val="24"/>
-        </w:rPr>
-        <w:t>Para superar una visión limitada al inventario, la literatura internacional aporta fundamentos sobre qué debe conservar un sistema de trazabilidad. Moe (1998) distinguió la trazabilidad interna de aquella que enlaza distintas etapas de una cadena y resaltó la necesidad de definir unidades rastreables. Olsen y Borit (2013) situaron la trazabilidad en la posibilidad de acceder a información sobre objetos considerados a lo largo de su ciclo de vida, mientras que Dabbene et al. (2014) examinaron los problemas de identificación, granularidad, transformación y recuperación de genealogía en cadenas físicas. Aunque estas contribuciones proceden principalmente del ámbito agroalimentario, permiten establecer que reconstruir una cadena requiere conservar tanto las unidades y sus atributos como las relaciones producidas cuando cambian, se agrupan o se transfieren.</w:t>
-      </w:r>
-    </w:p>
-    <w:p>
-      <w:r>
-        <w:rPr>
-          <w:rFonts w:ascii="Times New Roman" w:hAnsi="Times New Roman"/>
-          <w:sz w:val="24"/>
-        </w:rPr>
-        <w:t>Sobre esa base conceptual, Thakur et al. (2011) mostraron que los eventos de negocio pueden representar estados, movimientos y transformaciones, separando los datos maestros de los hechos ocurridos. Solanki y Brewster (2014) profundizaron esta representación al modelar transformaciones que vinculan unidades de entrada y salida, de modo que los eventos relacionados permitan recuperar su procedencia. El principio es transferible a R3Foresta porque un historial enlazado puede explicar los cambios de saldo y las relaciones entre unidades de material vegetal. Su aplicación requiere, no obstante, reglas propias para registrar la transformación biológica observada, la mortalidad o merma, las asignaciones parciales y la vinculación del lote con una ubicación de plantación. Esta transferencia conceptual no implica implementar literalmente EPCIS ni adoptar los procesos del dominio agroalimentario de las fuentes.</w:t>
-      </w:r>
-    </w:p>
-    <w:p>
-      <w:r>
-        <w:rPr>
-          <w:rFonts w:ascii="Times New Roman" w:hAnsi="Times New Roman"/>
-          <w:sz w:val="24"/>
-        </w:rPr>
-        <w:t>La representación histórica tampoco basta si los movimientos y las cantidades pueden quedar inconexos o si la capacidad de reconstrucción solo se presupone. ISO 22095:2020 proporciona terminología y modelos generales para la cadena de custodia, pero aclara que un sistema no demuestra por sí mismo la veracidad de las declaraciones registradas (ISO, 2020). Desde una perspectiva empírica, Donnelly et al. (2012) evaluaron sistemas de trazabilidad mediante un ejercicio de retiro simulado que exigía recuperar el origen y la información asociada a los lotes. Este enfoque respalda la necesidad de comprobar la reconstrucción mediante preguntas, fuentes recuperadas, vacíos y tiempo empleado, sin trasladar a R3Foresta el contexto de inocuidad alimentaria. En conjunto, estos antecedentes muestran que la trazabilidad requiere relacionar los eventos con reglas de consistencia y evidencia, y que su recuperabilidad debe evaluarse en la práctica.</w:t>
-      </w:r>
-    </w:p>
-    <w:p>
-      <w:r>
-        <w:rPr>
-          <w:rFonts w:ascii="Times New Roman" w:hAnsi="Times New Roman"/>
-          <w:sz w:val="24"/>
-        </w:rPr>
-        <w:t>Entre las fuentes revisadas no se identificó una solución que integrara, dentro de un mismo flujo, la procedencia del material vegetal, sus transformaciones, los movimientos entre etapas, la consistencia de cantidades y saldos y la evidencia asociada a la plantación, de forma que permitiera reconstruir posteriormente su cadena de custodia. Esta síntesis se limita al conjunto y alcance de la búsqueda bibliográfica realizada y no afirma la inexistencia absoluta de soluciones similares.</w:t>
-      </w:r>
-    </w:p>
-    <w:p>
-      <w:pPr>
-        <w:pStyle w:val="Heading1"/>
-      </w:pPr>
-      <w:r>
-        <w:rPr>
-          <w:rFonts w:ascii="Times New Roman" w:hAnsi="Times New Roman"/>
-          <w:sz w:val="28"/>
-        </w:rPr>
-        <w:t>3. Planteamiento del problema</w:t>
-      </w:r>
-    </w:p>
-    <w:p>
-      <w:pPr>
-        <w:pStyle w:val="Heading2"/>
-      </w:pPr>
-      <w:r>
-        <w:rPr>
-          <w:rFonts w:ascii="Times New Roman" w:hAnsi="Times New Roman"/>
-          <w:sz w:val="24"/>
-        </w:rPr>
-        <w:t>3.1. Situación problemática</w:t>
-      </w:r>
-    </w:p>
-    <w:p>
-      <w:r>
-        <w:rPr>
-          <w:rFonts w:ascii="Times New Roman" w:hAnsi="Times New Roman"/>
-          <w:sz w:val="24"/>
-        </w:rPr>
-        <w:t>R3Foresta realiza actividades de reforestación con comunidades, voluntarios y organizaciones patrocinadoras. La evidencia disponible de esas actividades se conserva actualmente en fotografías, publicaciones en redes sociales, conversaciones de mensajería, cuadernos, notas y la memoria de las personas involucradas. Estas fuentes permiten comunicar que una actividad ocurrió, pero no constituyen por sí mismas una estructura común para reconstruir de extremo a extremo la procedencia y el recorrido del material vegetal destinado a ellas.</w:t>
-      </w:r>
-    </w:p>
-    <w:p>
-      <w:r>
-        <w:rPr>
-          <w:rFonts w:ascii="Times New Roman" w:hAnsi="Times New Roman"/>
-          <w:sz w:val="24"/>
-        </w:rPr>
-        <w:t>El proceso comienza con la recolección de semillas, continúa con su manejo en vivero y concluye con la plantación de las plantas obtenidas. También puede ingresar material vegetal adquirido o recibido de terceros directamente en Vivero o Plantación. En estos casos es necesario registrar el ingreso externo como un hecho del historial, conservar los datos de procedencia disponibles y relacionar los eventos posteriores hasta la plantación.</w:t>
-      </w:r>
-    </w:p>
-    <w:p>
-      <w:r>
-        <w:rPr>
-          <w:rFonts w:ascii="Times New Roman" w:hAnsi="Times New Roman"/>
-          <w:sz w:val="24"/>
-        </w:rPr>
-        <w:t>Durante el recorrido cambian la ubicación, el responsable, el estado, la agrupación y, en ciertos procesos, la unidad de medida del material vegetal. Las semillas recolectadas pueden expresarse en gramos o unidades de propagación, mientras que el saldo vivo del vivero y la plantación se expresan en unidades de plantas. Este cambio no es una conversión aritmética automática, sino el resultado observado de un proceso biológico. También pueden ocurrir mermas, descartes, devoluciones, cierres y asignaciones parciales.</w:t>
-      </w:r>
-    </w:p>
-    <w:p>
-      <w:r>
-        <w:rPr>
-          <w:rFonts w:ascii="Times New Roman" w:hAnsi="Times New Roman"/>
-          <w:sz w:val="24"/>
-        </w:rPr>
-        <w:t>Cuando las salidas y entradas se registran de manera separada, o cuando un saldo puede alterarse sin conservar el hecho que lo explica, aparecen riesgos de registros incompletos, doble asignación, doble consumo y cantidades difíciles de conciliar. De manera similar, una fotografía o coordenada guardada fuera del hecho operativo puede perder su relación con la especie, cantidad, fecha y responsable que debía respaldar.</w:t>
-      </w:r>
-    </w:p>
-    <w:p>
-      <w:r>
-        <w:rPr>
-          <w:rFonts w:ascii="Times New Roman" w:hAnsi="Times New Roman"/>
-          <w:sz w:val="24"/>
-        </w:rPr>
-        <w:t>La consecuencia principal es una capacidad limitada para reconstruir la cadena de custodia con evidencia contrastable. Esto afecta las decisiones internas sobre disponibilidad y pérdidas, así como la capacidad de respaldar la información comunicada a empresas patrocinadoras y aliados. El problema es informacional: el sistema puede fortalecer la consistencia y recuperabilidad de lo registrado, pero no puede garantizar por sí solo que una declaración del operador sea físicamente verdadera.</w:t>
-      </w:r>
-    </w:p>
-    <w:p>
-      <w:pPr>
-        <w:pStyle w:val="Heading2"/>
-      </w:pPr>
-      <w:r>
-        <w:rPr>
-          <w:rFonts w:ascii="Times New Roman" w:hAnsi="Times New Roman"/>
-          <w:sz w:val="24"/>
-        </w:rPr>
-        <w:t>3.2. Árbol de causas y efectos</w:t>
-      </w:r>
-    </w:p>
-    <w:p>
-      <w:r>
-        <w:rPr>
-          <w:rFonts w:ascii="Times New Roman" w:hAnsi="Times New Roman"/>
-          <w:sz w:val="24"/>
-        </w:rPr>
-        <w:t>Las causas se formulan como hipótesis de diagnóstico y serán confirmadas, modificadas o descartadas mediante entrevistas, inventario documental y reconstrucción de casos históricos.</w:t>
-      </w:r>
-    </w:p>
-    <w:p>
       <w:pPr>
         <w:pStyle w:val="Caption"/>
       </w:pPr>
@@ -1225,7 +1131,7 @@
           <w:rFonts w:ascii="Times New Roman" w:hAnsi="Times New Roman"/>
           <w:sz w:val="22"/>
         </w:rPr>
-        <w:t>Figura 1. Árbol de causas y efectos.</w:t>
+        <w:t>Figura 1. Estructura organizacional de R3Foresta.</w:t>
       </w:r>
     </w:p>
     <w:p>
@@ -1237,8 +1143,251 @@
       <w:r>
         <w:drawing>
           <wp:inline xmlns:a="http://schemas.openxmlformats.org/drawingml/2006/main" xmlns:pic="http://schemas.openxmlformats.org/drawingml/2006/picture">
+            <wp:extent cx="5230368" cy="3922776"/>
+            <wp:docPr id="2" name="Picture 2"/>
+            <wp:cNvGraphicFramePr>
+              <a:graphicFrameLocks noChangeAspect="1"/>
+            </wp:cNvGraphicFramePr>
+            <a:graphic>
+              <a:graphicData uri="http://schemas.openxmlformats.org/drawingml/2006/picture">
+                <pic:pic>
+                  <pic:nvPicPr>
+                    <pic:cNvPr id="0" name="organigrama_r3foresta.png"/>
+                    <pic:cNvPicPr/>
+                  </pic:nvPicPr>
+                  <pic:blipFill>
+                    <a:blip r:embed="rId14"/>
+                    <a:stretch>
+                      <a:fillRect/>
+                    </a:stretch>
+                  </pic:blipFill>
+                  <pic:spPr>
+                    <a:xfrm>
+                      <a:off x="0" y="0"/>
+                      <a:ext cx="5230368" cy="3922776"/>
+                    </a:xfrm>
+                    <a:prstGeom prst="rect"/>
+                  </pic:spPr>
+                </pic:pic>
+              </a:graphicData>
+            </a:graphic>
+          </wp:inline>
+        </w:drawing>
+      </w:r>
+    </w:p>
+    <w:p>
+      <w:r>
+        <w:rPr>
+          <w:rFonts w:ascii="Times New Roman" w:hAnsi="Times New Roman"/>
+          <w:i/>
+          <w:sz w:val="24"/>
+        </w:rPr>
+        <w:t>Fuente: organigrama institucional proporcionado por la Fundación R3Foresta.</w:t>
+      </w:r>
+    </w:p>
+    <w:p>
+      <w:r>
+        <w:rPr>
+          <w:rFonts w:ascii="Times New Roman" w:hAnsi="Times New Roman"/>
+          <w:sz w:val="24"/>
+        </w:rPr>
+        <w:t xml:space="preserve">En la dimensión científico-tecnológica, R3Foresta integra medición, monitoreo, trazabilidad, digitalización e innovación. Dentro de R3Carbon desarrolla </w:t>
+      </w:r>
+      <w:r>
+        <w:rPr>
+          <w:rFonts w:ascii="Times New Roman" w:hAnsi="Times New Roman"/>
+          <w:b/>
+          <w:sz w:val="24"/>
+        </w:rPr>
+        <w:t>R3foresta App</w:t>
+      </w:r>
+      <w:r>
+        <w:rPr>
+          <w:rFonts w:ascii="Times New Roman" w:hAnsi="Times New Roman"/>
+          <w:sz w:val="24"/>
+        </w:rPr>
+        <w:t>, la aplicación destinada a registrar y relacionar el recorrido del material vegetal desde la recolección de semillas o su recepción externa, pasando por el manejo en vivero, hasta el registro de su plantación. Esta función convierte a la aplicación en la base operativa de la cadena de custodia del material vegetal y organiza la información y las evidencias utilizadas por la Fundación para su gestión y rendición de cuentas.</w:t>
+      </w:r>
+    </w:p>
+    <w:p>
+      <w:pPr>
+        <w:pStyle w:val="Heading2"/>
+      </w:pPr>
+      <w:r>
+        <w:rPr>
+          <w:rFonts w:ascii="Times New Roman" w:hAnsi="Times New Roman"/>
+          <w:sz w:val="24"/>
+        </w:rPr>
+        <w:t>2.2. Antecedentes académicos y tecnológicos</w:t>
+      </w:r>
+    </w:p>
+    <w:p>
+      <w:r>
+        <w:rPr>
+          <w:rFonts w:ascii="Times New Roman" w:hAnsi="Times New Roman"/>
+          <w:sz w:val="24"/>
+        </w:rPr>
+        <w:t>La revisión de trabajos académicos y sistemas similares avanza desde las experiencias más cercanas al ámbito forestal boliviano hacia los fundamentos y mecanismos de trazabilidad aplicables al problema de R3Foresta.</w:t>
+      </w:r>
+    </w:p>
+    <w:p>
+      <w:r>
+        <w:rPr>
+          <w:rFonts w:ascii="Times New Roman" w:hAnsi="Times New Roman"/>
+          <w:sz w:val="24"/>
+        </w:rPr>
+        <w:t>En Bolivia, Limachi Mamani (2020) desarrolló un sistema de registro y geolocalización de viveros para la Autoridad de Fiscalización y Control Social de Bosques y Tierra. El trabajo administra viveros, especies y volúmenes de producción, y demuestra la pertinencia de emplear sistemas georreferenciados en la gestión forestal del país. Su unidad principal de registro, sin embargo, es el vivero; por ello, el aporte se concentra en identificar y localizar unidades productivas y no en reconstruir el recorrido del material vegetal desde su procedencia hasta la plantación.</w:t>
+      </w:r>
+    </w:p>
+    <w:p>
+      <w:r>
+        <w:rPr>
+          <w:rFonts w:ascii="Times New Roman" w:hAnsi="Times New Roman"/>
+          <w:sz w:val="24"/>
+        </w:rPr>
+        <w:t>La digitalización de viveros ha avanzado también en el contexto latinoamericano. Salamanca Contreras (2024) implementó un sistema web para el control interno y el inventario de un vivero comercial y reportó mejoras en la exactitud del inventario y el cumplimiento de despachos. Mayorga Vásquez et al. (2022), por su parte, propusieron un sistema web para procesos administrativos y productivos de viveros. Estos trabajos muestran que existencias, producción y despachos pueden gestionarse digitalmente, pero permanecen centrados en la administración interna del vivero: no relacionan de extremo a extremo la procedencia del material vegetal, sus transferencias hacia actividades de reforestación y la evidencia geográfica de la plantación.</w:t>
+      </w:r>
+    </w:p>
+    <w:p>
+      <w:r>
+        <w:rPr>
+          <w:rFonts w:ascii="Times New Roman" w:hAnsi="Times New Roman"/>
+          <w:sz w:val="24"/>
+        </w:rPr>
+        <w:t>Para superar una visión limitada al inventario, la literatura internacional aporta fundamentos sobre qué debe conservar un sistema de trazabilidad. Moe (1998) distinguió la trazabilidad interna de aquella que enlaza distintas etapas de una cadena y resaltó la necesidad de definir unidades rastreables. Olsen y Borit (2013) situaron la trazabilidad en la posibilidad de acceder a información sobre objetos considerados a lo largo de su ciclo de vida, mientras que Dabbene et al. (2014) examinaron los problemas de identificación, granularidad, transformación y recuperación de genealogía en cadenas físicas. Aunque estas contribuciones proceden principalmente del ámbito agroalimentario, permiten establecer que reconstruir una cadena requiere conservar tanto las unidades y sus atributos como las relaciones producidas cuando cambian, se agrupan o se transfieren.</w:t>
+      </w:r>
+    </w:p>
+    <w:p>
+      <w:r>
+        <w:rPr>
+          <w:rFonts w:ascii="Times New Roman" w:hAnsi="Times New Roman"/>
+          <w:sz w:val="24"/>
+        </w:rPr>
+        <w:t>Sobre esa base conceptual, Thakur et al. (2011) mostraron que los eventos de negocio pueden representar estados, movimientos y transformaciones, separando los datos maestros de los hechos ocurridos. Solanki y Brewster (2014) profundizaron esta representación al modelar transformaciones que vinculan unidades de entrada y salida, de modo que los eventos relacionados permitan recuperar su procedencia. El principio es transferible a R3Foresta porque un historial enlazado puede explicar los cambios de saldo y las relaciones entre unidades de material vegetal. Su aplicación requiere, no obstante, reglas propias para registrar la transformación biológica observada, la mortalidad o merma, las asignaciones parciales y la vinculación del lote con una ubicación de plantación. Esta transferencia conceptual no implica implementar literalmente EPCIS ni adoptar los procesos del dominio agroalimentario de las fuentes.</w:t>
+      </w:r>
+    </w:p>
+    <w:p>
+      <w:r>
+        <w:rPr>
+          <w:rFonts w:ascii="Times New Roman" w:hAnsi="Times New Roman"/>
+          <w:sz w:val="24"/>
+        </w:rPr>
+        <w:t>La representación histórica tampoco basta si los movimientos y las cantidades pueden quedar inconexos o si la capacidad de reconstrucción solo se presupone. ISO 22095:2020 proporciona terminología y modelos generales para la cadena de custodia, pero aclara que un sistema no demuestra por sí mismo la veracidad de las declaraciones registradas (ISO, 2020). Desde una perspectiva empírica, Donnelly et al. (2012) evaluaron sistemas de trazabilidad mediante un ejercicio de retiro simulado que exigía recuperar el origen y la información asociada a los lotes. Este enfoque respalda la necesidad de comprobar la reconstrucción mediante preguntas, fuentes recuperadas, vacíos y tiempo empleado, sin trasladar a R3Foresta el contexto de inocuidad alimentaria. En conjunto, estos antecedentes muestran que la trazabilidad requiere relacionar los eventos con reglas de consistencia y evidencia, y que su recuperabilidad debe evaluarse en la práctica.</w:t>
+      </w:r>
+    </w:p>
+    <w:p>
+      <w:r>
+        <w:rPr>
+          <w:rFonts w:ascii="Times New Roman" w:hAnsi="Times New Roman"/>
+          <w:sz w:val="24"/>
+        </w:rPr>
+        <w:t>Entre las fuentes revisadas no se identificó una solución que integrara, dentro de un mismo flujo, la procedencia del material vegetal, sus transformaciones, los movimientos entre etapas, la consistencia de cantidades y saldos y la evidencia asociada a la plantación, de forma que permitiera reconstruir posteriormente su cadena de custodia. Esta síntesis se limita al conjunto y alcance de la búsqueda bibliográfica realizada y no afirma la inexistencia absoluta de soluciones similares.</w:t>
+      </w:r>
+    </w:p>
+    <w:p>
+      <w:pPr>
+        <w:pStyle w:val="Heading1"/>
+      </w:pPr>
+      <w:r>
+        <w:rPr>
+          <w:rFonts w:ascii="Times New Roman" w:hAnsi="Times New Roman"/>
+          <w:sz w:val="28"/>
+        </w:rPr>
+        <w:t>3. Planteamiento del problema</w:t>
+      </w:r>
+    </w:p>
+    <w:p>
+      <w:pPr>
+        <w:pStyle w:val="Heading2"/>
+      </w:pPr>
+      <w:r>
+        <w:rPr>
+          <w:rFonts w:ascii="Times New Roman" w:hAnsi="Times New Roman"/>
+          <w:sz w:val="24"/>
+        </w:rPr>
+        <w:t>3.1. Situación problemática</w:t>
+      </w:r>
+    </w:p>
+    <w:p>
+      <w:r>
+        <w:rPr>
+          <w:rFonts w:ascii="Times New Roman" w:hAnsi="Times New Roman"/>
+          <w:sz w:val="24"/>
+        </w:rPr>
+        <w:t>R3Foresta realiza actividades de reforestación con comunidades, voluntarios y organizaciones patrocinadoras. La información y las evidencias de estas actividades se conservan actualmente en fotografías, publicaciones en redes sociales, conversaciones de mensajería, cuadernos, notas y el conocimiento de las personas involucradas. Estos registros se encuentran dispersos y no comparten una estructura, identificadores ni relaciones comunes que permitan reconstruir de extremo a extremo la procedencia y el recorrido del material vegetal, las cantidades administradas, los responsables de cada etapa, las ubicaciones y las evidencias asociadas.</w:t>
+      </w:r>
+    </w:p>
+    <w:p>
+      <w:r>
+        <w:rPr>
+          <w:rFonts w:ascii="Times New Roman" w:hAnsi="Times New Roman"/>
+          <w:sz w:val="24"/>
+        </w:rPr>
+        <w:t>El material vegetal utilizado por R3Foresta puede ser de origen propio o externo. En el primer caso, la organización recolecta semillas u otro material de propagación, lo traslada al vivero, registra los procesos biológicos y obtiene plantas destinadas a la plantación. En el segundo, adquiere o recibe plantas y otros materiales vegetales de proveedores o terceros, los cuales pueden ingresar al vivero o dirigirse directamente a una plantación. En ambos casos, la cadena requiere relacionar la procedencia, la especie, las cantidades, las fechas, los responsables y las evidencias con los eventos posteriores hasta el destino del material.</w:t>
+      </w:r>
+    </w:p>
+    <w:p>
+      <w:r>
+        <w:rPr>
+          <w:rFonts w:ascii="Times New Roman" w:hAnsi="Times New Roman"/>
+          <w:sz w:val="24"/>
+        </w:rPr>
+        <w:t>Durante este recorrido cambian la ubicación, el responsable, el estado, la agrupación y, en determinados procesos, la unidad de medida del material vegetal. Las semillas recolectadas pueden registrarse en gramos o unidades de propagación, mientras que el saldo vivo del vivero y la plantación se expresa en unidades de plantas. El paso de semillas a plantas no constituye una conversión aritmética automática, sino un resultado biológico observado. El proceso también comprende mermas, descartes, devoluciones, cierres, transferencias y asignaciones parciales.</w:t>
+      </w:r>
+    </w:p>
+    <w:p>
+      <w:r>
+        <w:rPr>
+          <w:rFonts w:ascii="Times New Roman" w:hAnsi="Times New Roman"/>
+          <w:sz w:val="24"/>
+        </w:rPr>
+        <w:t>Actualmente, las entradas, salidas, transformaciones, transferencias y modificaciones de saldo se documentan en fuentes separadas y no conforman un historial común que explique cada cambio. Esta fragmentación dificulta conciliar las cantidades entre etapas, determinar la disponibilidad real del material y evitar registros incompletos, dobles asignaciones o dobles consumos. De igual manera, las fotografías, fechas o coordenadas almacenadas fuera del hecho operativo quedan desvinculadas de la especie, la cantidad, el responsable y el evento que deben respaldar.</w:t>
+      </w:r>
+    </w:p>
+    <w:p>
+      <w:r>
+        <w:rPr>
+          <w:rFonts w:ascii="Times New Roman" w:hAnsi="Times New Roman"/>
+          <w:sz w:val="24"/>
+        </w:rPr>
+        <w:t>Como consecuencia, R3Foresta tiene una capacidad limitada para reconstruir la cadena de custodia con evidencia contrastable. Esta situación dificulta las decisiones internas sobre disponibilidad, pérdidas, movimientos y destino del material vegetal, así como la presentación de información consistente a empresas patrocinadoras, aliados y otros actores que requieren conocer y contrastar el recorrido registrado.</w:t>
+      </w:r>
+    </w:p>
+    <w:p>
+      <w:pPr>
+        <w:pStyle w:val="Heading2"/>
+      </w:pPr>
+      <w:r>
+        <w:rPr>
+          <w:rFonts w:ascii="Times New Roman" w:hAnsi="Times New Roman"/>
+          <w:sz w:val="24"/>
+        </w:rPr>
+        <w:t>3.2. Árbol de causas y efectos</w:t>
+      </w:r>
+    </w:p>
+    <w:p>
+      <w:pPr>
+        <w:pStyle w:val="Caption"/>
+      </w:pPr>
+      <w:r>
+        <w:rPr>
+          <w:rFonts w:ascii="Times New Roman" w:hAnsi="Times New Roman"/>
+          <w:sz w:val="22"/>
+        </w:rPr>
+        <w:t>Figura 2. Árbol de causas y efectos.</w:t>
+      </w:r>
+    </w:p>
+    <w:p>
+      <w:pPr>
+        <w:spacing w:after="120"/>
+        <w:ind w:firstLine="0"/>
+        <w:jc w:val="center"/>
+      </w:pPr>
+      <w:r>
+        <w:drawing>
+          <wp:inline xmlns:a="http://schemas.openxmlformats.org/drawingml/2006/main" xmlns:pic="http://schemas.openxmlformats.org/drawingml/2006/picture">
             <wp:extent cx="5230368" cy="6211062"/>
-            <wp:docPr id="2" name="Picture 2"/>
+            <wp:docPr id="3" name="Picture 3"/>
             <wp:cNvGraphicFramePr>
               <a:graphicFrameLocks noChangeAspect="1"/>
             </wp:cNvGraphicFramePr>
@@ -1250,7 +1399,7 @@
                     <pic:cNvPicPr/>
                   </pic:nvPicPr>
                   <pic:blipFill>
-                    <a:blip r:embed="rId14"/>
+                    <a:blip r:embed="rId15"/>
                     <a:stretch>
                       <a:fillRect/>
                     </a:stretch>
@@ -1292,7 +1441,7 @@
           <w:i/>
           <w:sz w:val="24"/>
         </w:rPr>
-        <w:t>En la práctica actual de R3Foresta, la información sobre el recorrido del material vegetal, desde su origen o ingreso al proceso hasta su plantación, se conserva en registros dispersos que no comparten una estructura ni relaciones comunes; esta fragmentación limita la reconstrucción de la cadena de custodia, la comprobación de la consistencia de cantidades y saldos y la presentación de evidencia contrastable a los actores interesados.</w:t>
+        <w:t>En la práctica actual de R3Foresta, la información sobre la procedencia, los movimientos, las transformaciones, las cantidades, los responsables, las evidencias y el destino del material vegetal de origen propio o externo se conserva en registros dispersos que no comparten una estructura, identificadores ni relaciones comunes; esta fragmentación limita la reconstrucción de la cadena de custodia, la consistencia de cantidades y saldos y la presentación de evidencia contrastable a los actores interesados.</w:t>
       </w:r>
     </w:p>
     <w:p>
@@ -1330,7 +1479,7 @@
           <w:i/>
           <w:sz w:val="24"/>
         </w:rPr>
-        <w:t>¿Cómo desarrollar, en el caso R3Foresta, un sistema de trazabilidad que permita reconstruir con evidencia contrastable el recorrido del material vegetal desde su origen o ingreso al proceso hasta el registro de su plantación, y qué diferencias presenta frente a la práctica de registro actual en capacidad de reconstrucción y carga operativa?</w:t>
+        <w:t>¿Cómo desarrollar y evaluar, en el caso de R3Foresta, un sistema de trazabilidad para la cadena de custodia del material vegetal, desde su recolección o recepción externa hasta su manejo en vivero y plantación, que permita reconstruir con evidencia contrastable su procedencia, movimientos, cantidades, responsables y destino, y qué diferencias presenta respecto de la práctica actual en capacidad de reconstrucción y carga operativa?</w:t>
       </w:r>
     </w:p>
     <w:p>
@@ -1360,7 +1509,7 @@
           <w:rFonts w:ascii="Times New Roman" w:hAnsi="Times New Roman"/>
           <w:sz w:val="24"/>
         </w:rPr>
-        <w:t>¿Qué procesos, actores, datos, estados, eventos, unidades de medida y reglas de negocio intervienen en Recolección, Vivero y Plantación, incluidas las variantes de ingreso de material vegetal adquirido o recibido de terceros?</w:t>
+        <w:t>¿Qué procesos, actores, datos, estados, eventos, unidades de medida, requerimientos y reglas de negocio caracterizan Recolección, Vivero y Plantación, incluidas las variantes de ingreso de material vegetal adquirido o recibido de terceros?</w:t>
       </w:r>
     </w:p>
     <w:p>
@@ -1378,7 +1527,7 @@
           <w:rFonts w:ascii="Times New Roman" w:hAnsi="Times New Roman"/>
           <w:sz w:val="24"/>
         </w:rPr>
-        <w:t>¿Qué modelo de información y reglas de integridad permite relacionar los orígenes, movimientos, transformaciones, saldos, responsables y evidencias de la cadena de custodia?</w:t>
+        <w:t>¿Qué modelo de trazabilidad e integridad permite relacionar orígenes, entidades, eventos, transformaciones, cantidades, saldos, responsables y evidencias, y formalizar las reglas aplicables a las transferencias y transformaciones entre etapas?</w:t>
       </w:r>
     </w:p>
     <w:p>
@@ -1396,7 +1545,7 @@
           <w:rFonts w:ascii="Times New Roman" w:hAnsi="Times New Roman"/>
           <w:sz w:val="24"/>
         </w:rPr>
-        <w:t>¿Cómo implementar e integrar los módulos de Recolección, Vivero y Plantación y sus variantes de ingreso externo sin perder la historia de procedencia del material vegetal?</w:t>
+        <w:t>¿Cómo implementar e integrar los módulos de Recolección, Vivero y Plantación, incorporando el ingreso de material vegetal adquirido o recibido de terceros directamente en Vivero o Plantación, con sus datos de procedencia y su registro en el historial?</w:t>
       </w:r>
     </w:p>
     <w:p>
@@ -1432,7 +1581,7 @@
           <w:rFonts w:ascii="Times New Roman" w:hAnsi="Times New Roman"/>
           <w:sz w:val="24"/>
         </w:rPr>
-        <w:t>¿Qué capacidad presenta la solución para reconstruir trazas con evidencia contrastable y qué carga operativa genera respecto de la práctica actual de R3Foresta?</w:t>
+        <w:t>¿Qué capacidad presenta la solución, en el contexto del estudio de caso, para reconstruir trazas con evidencia contrastable y qué carga operativa genera en comparación con la práctica actual caracterizada en R3Foresta?</w:t>
       </w:r>
     </w:p>
     <w:p>
@@ -3022,7 +3171,7 @@
           <w:rFonts w:ascii="Times New Roman" w:hAnsi="Times New Roman"/>
           <w:sz w:val="24"/>
         </w:rPr>
-        <w:t>, que vincula la construcción y evaluación de un artefacto con un problema organizacional (Hevner et al., 2004). El proceso seguirá las actividades de DSRM: identificación del problema, definición de objetivos, diseño y desarrollo, demostración, evaluación y comunicación (Peffers et al., 2007).</w:t>
+        <w:t>, que vincula la construcción y evaluación de un artefacto con un problema organizacional (Hevner et al., 2004). El proceso seguirá las actividades de DSRM: identificación del problema, definición de objetivos, diseño y desarrollo, demostración, evaluación y comunicación (Peffers et al., 2007). El artefacto académico comprenderá el modelo de trazabilidad e integridad, sus reglas e invariantes, los tres módulos integrados, el mecanismo de reconstrucción y la evidencia obtenida al verificar y evaluar la solución; no se reducirá a las pantallas de la aplicación.</w:t>
       </w:r>
     </w:p>
     <w:p>
@@ -3046,7 +3195,7 @@
           <w:rFonts w:ascii="Times New Roman" w:hAnsi="Times New Roman"/>
           <w:sz w:val="24"/>
         </w:rPr>
-        <w:t>: la organización y su proceso constituyen el caso, y las trazas de cadena de custodia son las unidades embebidas. Este diseño permite analizar la solución dentro de su contexto y combinar documentos, registros, observación, entrevistas y resultados técnicos (Runeson &amp; Höst, 2009). El enfoque será mixto y descriptivo: utilizará conteos, porcentajes, tiempos y resultados de pruebas junto con observaciones y dificultades reportadas. Los resultados describirán el caso y no se generalizarán estadísticamente. Este planteamiento mantiene el carácter de investigación, programación y diseño exigido para un Proyecto de Grado de licenciatura (Comité Ejecutivo de la Universidad Boliviana, s. f.).</w:t>
+        <w:t>. El caso será el diseño, construcción y evaluación del proceso digital de trazabilidad del material vegetal en R3Foresta durante la ventana académica formal; la Fundación constituirá el contexto organizacional y las trazas de cadena de custodia serán las unidades embebidas. La elección de un solo caso se justifica por su relación directa con el problema, el acceso autorizado a sus procesos y registros y la profundidad requerida para estudiar la interacción entre organización, operación y artefacto. Este diseño permite combinar documentos, registros, observación, entrevistas y resultados técnicos (Runeson &amp; Höst, 2009). El enfoque será mixto y descriptivo: utilizará conteos, porcentajes, tiempos y resultados de pruebas junto con observaciones y dificultades reportadas. Los resultados describirán el caso y no se generalizarán estadísticamente. Este planteamiento mantiene el carácter de investigación, programación y diseño exigido para un Proyecto de Grado de licenciatura (Comité Ejecutivo de la Universidad Boliviana, s. f.).</w:t>
       </w:r>
     </w:p>
     <w:p>
@@ -3095,18 +3244,27 @@
       </w:r>
     </w:p>
     <w:p>
-      <w:pPr>
-        <w:pStyle w:val="Heading2"/>
-      </w:pPr>
       <w:r>
         <w:rPr>
           <w:rFonts w:ascii="Times New Roman" w:hAnsi="Times New Roman"/>
           <w:sz w:val="24"/>
         </w:rPr>
-        <w:t>8.3. Metodología de desarrollo</w:t>
+        <w:t>Antes de la recolección se delimitarán además los procesos, sitios, actores y fuentes incluidos. El diseño embebido requerirá varias trazas y concluirá con una síntesis del caso completo. Si solo resultara disponible una unidad de análisis, se revisará la denominación metodológica en lugar de conservar una clasificación que la evidencia no sostenga.</w:t>
       </w:r>
     </w:p>
     <w:p>
+      <w:pPr>
+        <w:pStyle w:val="Heading2"/>
+      </w:pPr>
+      <w:r>
+        <w:rPr>
+          <w:rFonts w:ascii="Times New Roman" w:hAnsi="Times New Roman"/>
+          <w:sz w:val="24"/>
+        </w:rPr>
+        <w:t>8.3. Metodología de desarrollo</w:t>
+      </w:r>
+    </w:p>
+    <w:p>
       <w:r>
         <w:rPr>
           <w:rFonts w:ascii="Times New Roman" w:hAnsi="Times New Roman"/>
@@ -3176,6 +3334,15 @@
           <w:sz w:val="24"/>
         </w:rPr>
         <w:t xml:space="preserve"> y deberá quedar demostrada dentro del semestre. Los prototipos anteriores podrán utilizarse como referencia técnica y evidencia de factibilidad, pero no como la construcción formal presentada. Cada sprint conservará evidencia proporcionada a su alcance: versión inicial y final, requerimientos abordados, cambios principales, migraciones, pruebas críticas, demostración y decisiones relevantes.</w:t>
+      </w:r>
+    </w:p>
+    <w:p>
+      <w:r>
+        <w:rPr>
+          <w:rFonts w:ascii="Times New Roman" w:hAnsi="Times New Roman"/>
+          <w:sz w:val="24"/>
+        </w:rPr>
+        <w:t>Cada incremento incluirá, según su alcance, selección de requisitos y riesgos, análisis, diseño, construcción, integración, pruebas, demostración, actualización documental y retrospectiva. El seguimiento registrará lo planificado y lo realizado, la evidencia disponible, las desviaciones, las decisiones adoptadas, las incidencias críticas y las horas académicas. Estos controles respaldarán la ejecución, pero no constituirán una metodología de investigación adicional.</w:t>
       </w:r>
     </w:p>
     <w:p>
@@ -3901,7 +4068,7 @@
           <w:rFonts w:ascii="Times New Roman" w:hAnsi="Times New Roman"/>
           <w:sz w:val="24"/>
         </w:rPr>
-        <w:t xml:space="preserve">Para caracterizar la </w:t>
+        <w:t xml:space="preserve">La evaluación combinará verificación técnica formativa durante los incrementos y evaluación operativa descriptiva en la situación actual y el piloto. Para caracterizar la </w:t>
       </w:r>
       <w:r>
         <w:rPr>
@@ -4015,7 +4182,7 @@
           <w:rFonts w:ascii="Times New Roman" w:hAnsi="Times New Roman"/>
           <w:sz w:val="22"/>
         </w:rPr>
-        <w:t>Figura 2. Recorrido principal del material vegetal.</w:t>
+        <w:t>Figura 3. Recorrido principal del material vegetal.</w:t>
       </w:r>
     </w:p>
     <w:p>
@@ -4028,7 +4195,7 @@
         <w:drawing>
           <wp:inline xmlns:a="http://schemas.openxmlformats.org/drawingml/2006/main" xmlns:pic="http://schemas.openxmlformats.org/drawingml/2006/picture">
             <wp:extent cx="5230368" cy="1987540"/>
-            <wp:docPr id="3" name="Picture 3"/>
+            <wp:docPr id="4" name="Picture 4"/>
             <wp:cNvGraphicFramePr>
               <a:graphicFrameLocks noChangeAspect="1"/>
             </wp:cNvGraphicFramePr>
@@ -4040,7 +4207,7 @@
                     <pic:cNvPicPr/>
                   </pic:nvPicPr>
                   <pic:blipFill>
-                    <a:blip r:embed="rId15"/>
+                    <a:blip r:embed="rId16"/>
                     <a:stretch>
                       <a:fillRect/>
                     </a:stretch>
@@ -4089,7 +4256,7 @@
           <w:rFonts w:ascii="Times New Roman" w:hAnsi="Times New Roman"/>
           <w:sz w:val="22"/>
         </w:rPr>
-        <w:t>Figura 3. Relación entre eventos, reglas de consistencia y reconstrucción.</w:t>
+        <w:t>Figura 4. Relación entre eventos, reglas de consistencia y reconstrucción.</w:t>
       </w:r>
     </w:p>
     <w:p>
@@ -4102,7 +4269,7 @@
         <w:drawing>
           <wp:inline xmlns:a="http://schemas.openxmlformats.org/drawingml/2006/main" xmlns:pic="http://schemas.openxmlformats.org/drawingml/2006/picture">
             <wp:extent cx="5230368" cy="2222906"/>
-            <wp:docPr id="4" name="Picture 4"/>
+            <wp:docPr id="5" name="Picture 5"/>
             <wp:cNvGraphicFramePr>
               <a:graphicFrameLocks noChangeAspect="1"/>
             </wp:cNvGraphicFramePr>
@@ -4114,7 +4281,7 @@
                     <pic:cNvPicPr/>
                   </pic:nvPicPr>
                   <pic:blipFill>
-                    <a:blip r:embed="rId16"/>
+                    <a:blip r:embed="rId17"/>
                     <a:stretch>
                       <a:fillRect/>
                     </a:stretch>
@@ -4338,7 +4505,7 @@
           <w:b w:val="0"/>
           <w:sz w:val="20"/>
         </w:rPr>
-        <w:t>Contexto, problema, objetivos, justificación, alcance y estructura</w:t>
+        <w:t>Sección independiente que se redactará al finalizar todos los capítulos</w:t>
       </w:r>
     </w:p>
     <w:p>
@@ -4357,7 +4524,7 @@
           <w:b/>
           <w:sz w:val="20"/>
         </w:rPr>
-        <w:t>Capítulo I — Marco teórico y conceptual</w:t>
+        <w:t>Capítulo I — Marco introductorio</w:t>
       </w:r>
     </w:p>
     <w:p>
@@ -4371,7 +4538,7 @@
           <w:b w:val="0"/>
           <w:sz w:val="20"/>
         </w:rPr>
-        <w:t>1.1 Material vegetal, trazabilidad y cadena de custodia</w:t>
+        <w:t>1.1 Antecedentes institucionales, operativos y trabajos similares</w:t>
       </w:r>
     </w:p>
     <w:p>
@@ -4385,7 +4552,7 @@
           <w:b w:val="0"/>
           <w:sz w:val="20"/>
         </w:rPr>
-        <w:t>1.2 Unidades trazables, eventos, transformaciones y procedencia</w:t>
+        <w:t>1.2 Planteamiento del problema</w:t>
       </w:r>
     </w:p>
     <w:p>
@@ -4399,7 +4566,7 @@
           <w:b w:val="0"/>
           <w:sz w:val="20"/>
         </w:rPr>
-        <w:t>1.3 Integridad de cantidades y operaciones</w:t>
+        <w:t>1.3 Objetivos</w:t>
       </w:r>
     </w:p>
     <w:p>
@@ -4413,17 +4580,73 @@
           <w:b w:val="0"/>
           <w:sz w:val="20"/>
         </w:rPr>
-        <w:t>1.4 Evidencia, información geográfica y reconstrucción</w:t>
+        <w:t>1.4 Justificación</w:t>
       </w:r>
     </w:p>
     <w:p>
       <w:pPr>
-        <w:spacing w:after="40"/>
-      </w:pPr>
+        <w:spacing w:after="20" w:line="240" w:lineRule="auto"/>
+        <w:ind w:firstLine="0" w:left="136"/>
+      </w:pPr>
+      <w:r>
+        <w:rPr>
+          <w:rFonts w:ascii="Times New Roman" w:hAnsi="Times New Roman"/>
+          <w:b w:val="0"/>
+          <w:sz w:val="20"/>
+        </w:rPr>
+        <w:t>1.5 Alcances y límites</w:t>
+      </w:r>
     </w:p>
     <w:p>
       <w:pPr>
         <w:spacing w:after="20" w:line="240" w:lineRule="auto"/>
+        <w:ind w:firstLine="0" w:left="136"/>
+      </w:pPr>
+      <w:r>
+        <w:rPr>
+          <w:rFonts w:ascii="Times New Roman" w:hAnsi="Times New Roman"/>
+          <w:b w:val="0"/>
+          <w:sz w:val="20"/>
+        </w:rPr>
+        <w:t>1.6 Aportes esperados</w:t>
+      </w:r>
+    </w:p>
+    <w:p>
+      <w:pPr>
+        <w:spacing w:after="20" w:line="240" w:lineRule="auto"/>
+        <w:ind w:firstLine="0" w:left="136"/>
+      </w:pPr>
+      <w:r>
+        <w:rPr>
+          <w:rFonts w:ascii="Times New Roman" w:hAnsi="Times New Roman"/>
+          <w:b w:val="0"/>
+          <w:sz w:val="20"/>
+        </w:rPr>
+        <w:t>1.7 Diseño metodológico</w:t>
+      </w:r>
+    </w:p>
+    <w:p>
+      <w:pPr>
+        <w:spacing w:after="20" w:line="240" w:lineRule="auto"/>
+        <w:ind w:firstLine="0" w:left="136"/>
+      </w:pPr>
+      <w:r>
+        <w:rPr>
+          <w:rFonts w:ascii="Times New Roman" w:hAnsi="Times New Roman"/>
+          <w:b w:val="0"/>
+          <w:sz w:val="20"/>
+        </w:rPr>
+        <w:t>1.8 Organización del documento</w:t>
+      </w:r>
+    </w:p>
+    <w:p>
+      <w:pPr>
+        <w:spacing w:after="40"/>
+      </w:pPr>
+    </w:p>
+    <w:p>
+      <w:pPr>
+        <w:spacing w:after="20" w:line="240" w:lineRule="auto"/>
         <w:ind w:firstLine="0" w:left="0"/>
       </w:pPr>
       <w:r>
@@ -4432,7 +4655,7 @@
           <w:b/>
           <w:sz w:val="20"/>
         </w:rPr>
-        <w:t>Capítulo II — Marco referencial y contextual</w:t>
+        <w:t>Capítulo II — Marco teórico y conceptual</w:t>
       </w:r>
     </w:p>
     <w:p>
@@ -4446,7 +4669,7 @@
           <w:b w:val="0"/>
           <w:sz w:val="20"/>
         </w:rPr>
-        <w:t>2.1 Reforestación y material vegetal</w:t>
+        <w:t>2.1 Material vegetal y procesos de reforestación</w:t>
       </w:r>
     </w:p>
     <w:p>
@@ -4460,7 +4683,7 @@
           <w:b w:val="0"/>
           <w:sz w:val="20"/>
         </w:rPr>
-        <w:t>2.2 R3Foresta como caso de aplicación</w:t>
+        <w:t>2.2 Trazabilidad y cadena de custodia</w:t>
       </w:r>
     </w:p>
     <w:p>
@@ -4474,7 +4697,7 @@
           <w:b w:val="0"/>
           <w:sz w:val="20"/>
         </w:rPr>
-        <w:t>2.3 Actores y práctica de registro actual</w:t>
+        <w:t>2.3 Eventos, transformaciones y procedencia</w:t>
       </w:r>
     </w:p>
     <w:p>
@@ -4488,17 +4711,59 @@
           <w:b w:val="0"/>
           <w:sz w:val="20"/>
         </w:rPr>
-        <w:t>2.4 Antecedentes y brecha identificada</w:t>
+        <w:t>2.4 Integridad de cantidades y saldos</w:t>
       </w:r>
     </w:p>
     <w:p>
       <w:pPr>
-        <w:spacing w:after="40"/>
-      </w:pPr>
+        <w:spacing w:after="20" w:line="240" w:lineRule="auto"/>
+        <w:ind w:firstLine="0" w:left="136"/>
+      </w:pPr>
+      <w:r>
+        <w:rPr>
+          <w:rFonts w:ascii="Times New Roman" w:hAnsi="Times New Roman"/>
+          <w:b w:val="0"/>
+          <w:sz w:val="20"/>
+        </w:rPr>
+        <w:t>2.5 Evidencia e información geográfica</w:t>
+      </w:r>
     </w:p>
     <w:p>
       <w:pPr>
         <w:spacing w:after="20" w:line="240" w:lineRule="auto"/>
+        <w:ind w:firstLine="0" w:left="136"/>
+      </w:pPr>
+      <w:r>
+        <w:rPr>
+          <w:rFonts w:ascii="Times New Roman" w:hAnsi="Times New Roman"/>
+          <w:b w:val="0"/>
+          <w:sz w:val="20"/>
+        </w:rPr>
+        <w:t>2.6 Reconstrucción y evaluación de la trazabilidad</w:t>
+      </w:r>
+    </w:p>
+    <w:p>
+      <w:pPr>
+        <w:spacing w:after="20" w:line="240" w:lineRule="auto"/>
+        <w:ind w:firstLine="0" w:left="136"/>
+      </w:pPr>
+      <w:r>
+        <w:rPr>
+          <w:rFonts w:ascii="Times New Roman" w:hAnsi="Times New Roman"/>
+          <w:b w:val="0"/>
+          <w:sz w:val="20"/>
+        </w:rPr>
+        <w:t>2.7 Síntesis conceptual adoptada por R3Foresta</w:t>
+      </w:r>
+    </w:p>
+    <w:p>
+      <w:pPr>
+        <w:spacing w:after="40"/>
+      </w:pPr>
+    </w:p>
+    <w:p>
+      <w:pPr>
+        <w:spacing w:after="20" w:line="240" w:lineRule="auto"/>
         <w:ind w:firstLine="0" w:left="0"/>
       </w:pPr>
       <w:r>
@@ -4507,7 +4772,7 @@
           <w:b/>
           <w:sz w:val="20"/>
         </w:rPr>
-        <w:t>Capítulo III — Marco metodológico</w:t>
+        <w:t>Capítulo III — Marco aplicativo</w:t>
       </w:r>
     </w:p>
     <w:p>
@@ -4521,7 +4786,7 @@
           <w:b w:val="0"/>
           <w:sz w:val="20"/>
         </w:rPr>
-        <w:t>3.1 Ciencia del diseño y estudio de caso</w:t>
+        <w:t>Análisis, diseño, construcción e integración de la solución</w:t>
       </w:r>
     </w:p>
     <w:p>
@@ -4535,11 +4800,30 @@
           <w:b w:val="0"/>
           <w:sz w:val="20"/>
         </w:rPr>
-        <w:t>3.2 Unidades de análisis y participantes</w:t>
+        <w:t>Estructura interna pendiente de definición</w:t>
       </w:r>
     </w:p>
     <w:p>
       <w:pPr>
+        <w:spacing w:after="40"/>
+      </w:pPr>
+    </w:p>
+    <w:p>
+      <w:pPr>
+        <w:spacing w:after="20" w:line="240" w:lineRule="auto"/>
+        <w:ind w:firstLine="0" w:left="0"/>
+      </w:pPr>
+      <w:r>
+        <w:rPr>
+          <w:rFonts w:ascii="Times New Roman" w:hAnsi="Times New Roman"/>
+          <w:b/>
+          <w:sz w:val="20"/>
+        </w:rPr>
+        <w:t>Capítulos posteriores</w:t>
+      </w:r>
+    </w:p>
+    <w:p>
+      <w:pPr>
         <w:spacing w:after="20" w:line="240" w:lineRule="auto"/>
         <w:ind w:firstLine="0" w:left="136"/>
       </w:pPr>
@@ -4549,7 +4833,7 @@
           <w:b w:val="0"/>
           <w:sz w:val="20"/>
         </w:rPr>
-        <w:t>3.3 Desarrollo iterativo e incremental</w:t>
+        <w:t>Verificación y evaluación de resultados</w:t>
       </w:r>
     </w:p>
     <w:p>
@@ -4563,7 +4847,7 @@
           <w:b w:val="0"/>
           <w:sz w:val="20"/>
         </w:rPr>
-        <w:t>3.4 Evaluación, instrumentos y análisis</w:t>
+        <w:t>Conclusiones y recomendaciones</w:t>
       </w:r>
     </w:p>
     <w:p>
@@ -4577,227 +4861,7 @@
           <w:b w:val="0"/>
           <w:sz w:val="20"/>
         </w:rPr>
-        <w:t>3.5 Consideraciones éticas y amenazas a la validez</w:t>
-      </w:r>
-    </w:p>
-    <w:p>
-      <w:pPr>
-        <w:spacing w:after="40"/>
-      </w:pPr>
-    </w:p>
-    <w:p>
-      <w:pPr>
-        <w:spacing w:after="20" w:line="240" w:lineRule="auto"/>
-        <w:ind w:firstLine="0" w:left="0"/>
-      </w:pPr>
-      <w:r>
-        <w:rPr>
-          <w:rFonts w:ascii="Times New Roman" w:hAnsi="Times New Roman"/>
-          <w:b/>
-          <w:sz w:val="20"/>
-        </w:rPr>
-        <w:t>Capítulo IV — Desarrollo y resultados</w:t>
-      </w:r>
-    </w:p>
-    <w:p>
-      <w:pPr>
-        <w:spacing w:after="20" w:line="240" w:lineRule="auto"/>
-        <w:ind w:firstLine="0" w:left="136"/>
-      </w:pPr>
-      <w:r>
-        <w:rPr>
-          <w:rFonts w:ascii="Times New Roman" w:hAnsi="Times New Roman"/>
-          <w:b w:val="0"/>
-          <w:sz w:val="20"/>
-        </w:rPr>
-        <w:t>4.1 Procesos, requerimientos y reglas de negocio</w:t>
-      </w:r>
-    </w:p>
-    <w:p>
-      <w:pPr>
-        <w:spacing w:after="20" w:line="240" w:lineRule="auto"/>
-        <w:ind w:firstLine="0" w:left="408"/>
-      </w:pPr>
-      <w:r>
-        <w:rPr>
-          <w:rFonts w:ascii="Times New Roman" w:hAnsi="Times New Roman"/>
-          <w:b w:val="0"/>
-          <w:sz w:val="20"/>
-        </w:rPr>
-        <w:t>4.1.1 Recolección</w:t>
-      </w:r>
-    </w:p>
-    <w:p>
-      <w:pPr>
-        <w:spacing w:after="20" w:line="240" w:lineRule="auto"/>
-        <w:ind w:firstLine="0" w:left="408"/>
-      </w:pPr>
-      <w:r>
-        <w:rPr>
-          <w:rFonts w:ascii="Times New Roman" w:hAnsi="Times New Roman"/>
-          <w:b w:val="0"/>
-          <w:sz w:val="20"/>
-        </w:rPr>
-        <w:t>4.1.2 Vivero y transformación biológica observada</w:t>
-      </w:r>
-    </w:p>
-    <w:p>
-      <w:pPr>
-        <w:spacing w:after="20" w:line="240" w:lineRule="auto"/>
-        <w:ind w:firstLine="0" w:left="408"/>
-      </w:pPr>
-      <w:r>
-        <w:rPr>
-          <w:rFonts w:ascii="Times New Roman" w:hAnsi="Times New Roman"/>
-          <w:b w:val="0"/>
-          <w:sz w:val="20"/>
-        </w:rPr>
-        <w:t>4.1.3 Plantación e integración entre etapas</w:t>
-      </w:r>
-    </w:p>
-    <w:p>
-      <w:pPr>
-        <w:spacing w:after="20" w:line="240" w:lineRule="auto"/>
-        <w:ind w:firstLine="0" w:left="136"/>
-      </w:pPr>
-      <w:r>
-        <w:rPr>
-          <w:rFonts w:ascii="Times New Roman" w:hAnsi="Times New Roman"/>
-          <w:b w:val="0"/>
-          <w:sz w:val="20"/>
-        </w:rPr>
-        <w:t>4.2 Modelo de trazabilidad e integridad</w:t>
-      </w:r>
-    </w:p>
-    <w:p>
-      <w:pPr>
-        <w:spacing w:after="20" w:line="240" w:lineRule="auto"/>
-        <w:ind w:firstLine="0" w:left="136"/>
-      </w:pPr>
-      <w:r>
-        <w:rPr>
-          <w:rFonts w:ascii="Times New Roman" w:hAnsi="Times New Roman"/>
-          <w:b w:val="0"/>
-          <w:sz w:val="20"/>
-        </w:rPr>
-        <w:t>4.3 Implementación e integración de los tres módulos</w:t>
-      </w:r>
-    </w:p>
-    <w:p>
-      <w:pPr>
-        <w:spacing w:after="20" w:line="240" w:lineRule="auto"/>
-        <w:ind w:firstLine="0" w:left="136"/>
-      </w:pPr>
-      <w:r>
-        <w:rPr>
-          <w:rFonts w:ascii="Times New Roman" w:hAnsi="Times New Roman"/>
-          <w:b w:val="0"/>
-          <w:sz w:val="20"/>
-        </w:rPr>
-        <w:t>4.4 Verificación de requerimientos e invariantes</w:t>
-      </w:r>
-    </w:p>
-    <w:p>
-      <w:pPr>
-        <w:spacing w:after="20" w:line="240" w:lineRule="auto"/>
-        <w:ind w:firstLine="0" w:left="136"/>
-      </w:pPr>
-      <w:r>
-        <w:rPr>
-          <w:rFonts w:ascii="Times New Roman" w:hAnsi="Times New Roman"/>
-          <w:b w:val="0"/>
-          <w:sz w:val="20"/>
-        </w:rPr>
-        <w:t>4.5 Reconstrucción, comparación y carga operativa</w:t>
-      </w:r>
-    </w:p>
-    <w:p>
-      <w:pPr>
-        <w:spacing w:after="20" w:line="240" w:lineRule="auto"/>
-        <w:ind w:firstLine="0" w:left="136"/>
-      </w:pPr>
-      <w:r>
-        <w:rPr>
-          <w:rFonts w:ascii="Times New Roman" w:hAnsi="Times New Roman"/>
-          <w:b w:val="0"/>
-          <w:sz w:val="20"/>
-        </w:rPr>
-        <w:t>4.6 Discusión y limitaciones</w:t>
-      </w:r>
-    </w:p>
-    <w:p>
-      <w:pPr>
-        <w:spacing w:after="40"/>
-      </w:pPr>
-    </w:p>
-    <w:p>
-      <w:pPr>
-        <w:spacing w:after="20" w:line="240" w:lineRule="auto"/>
-        <w:ind w:firstLine="0" w:left="0"/>
-      </w:pPr>
-      <w:r>
-        <w:rPr>
-          <w:rFonts w:ascii="Times New Roman" w:hAnsi="Times New Roman"/>
-          <w:b/>
-          <w:sz w:val="20"/>
-        </w:rPr>
-        <w:t>Capítulo V — Conclusiones y recomendaciones</w:t>
-      </w:r>
-    </w:p>
-    <w:p>
-      <w:pPr>
-        <w:spacing w:after="20" w:line="240" w:lineRule="auto"/>
-        <w:ind w:firstLine="0" w:left="136"/>
-      </w:pPr>
-      <w:r>
-        <w:rPr>
-          <w:rFonts w:ascii="Times New Roman" w:hAnsi="Times New Roman"/>
-          <w:b w:val="0"/>
-          <w:sz w:val="20"/>
-        </w:rPr>
-        <w:t>5.1 Cumplimiento de objetivos</w:t>
-      </w:r>
-    </w:p>
-    <w:p>
-      <w:pPr>
-        <w:spacing w:after="20" w:line="240" w:lineRule="auto"/>
-        <w:ind w:firstLine="0" w:left="136"/>
-      </w:pPr>
-      <w:r>
-        <w:rPr>
-          <w:rFonts w:ascii="Times New Roman" w:hAnsi="Times New Roman"/>
-          <w:b w:val="0"/>
-          <w:sz w:val="20"/>
-        </w:rPr>
-        <w:t>5.2 Aportes</w:t>
-      </w:r>
-    </w:p>
-    <w:p>
-      <w:pPr>
-        <w:spacing w:after="20" w:line="240" w:lineRule="auto"/>
-        <w:ind w:firstLine="0" w:left="136"/>
-      </w:pPr>
-      <w:r>
-        <w:rPr>
-          <w:rFonts w:ascii="Times New Roman" w:hAnsi="Times New Roman"/>
-          <w:b w:val="0"/>
-          <w:sz w:val="20"/>
-        </w:rPr>
-        <w:t>5.3 Limitaciones</w:t>
-      </w:r>
-    </w:p>
-    <w:p>
-      <w:pPr>
-        <w:spacing w:after="20" w:line="240" w:lineRule="auto"/>
-        <w:ind w:firstLine="0" w:left="136"/>
-      </w:pPr>
-      <w:r>
-        <w:rPr>
-          <w:rFonts w:ascii="Times New Roman" w:hAnsi="Times New Roman"/>
-          <w:b w:val="0"/>
-          <w:sz w:val="20"/>
-        </w:rPr>
-        <w:t>5.4 Trabajo futuro</w:t>
+        <w:t>Denominación y numeración pendientes de definición</w:t>
       </w:r>
     </w:p>
     <w:p>
@@ -5029,7 +5093,7 @@
                 <w:rFonts w:ascii="Times New Roman" w:hAnsi="Times New Roman"/>
                 <w:sz w:val="18"/>
               </w:rPr>
-              <w:t>4.1</w:t>
+              <w:t>Capítulo III, sección por definir</w:t>
             </w:r>
           </w:p>
         </w:tc>
@@ -5112,7 +5176,7 @@
                 <w:rFonts w:ascii="Times New Roman" w:hAnsi="Times New Roman"/>
                 <w:sz w:val="18"/>
               </w:rPr>
-              <w:t>4.2</w:t>
+              <w:t>Capítulo III, sección por definir</w:t>
             </w:r>
           </w:p>
         </w:tc>
@@ -5192,7 +5256,7 @@
                 <w:rFonts w:ascii="Times New Roman" w:hAnsi="Times New Roman"/>
                 <w:sz w:val="18"/>
               </w:rPr>
-              <w:t>4.3</w:t>
+              <w:t>Capítulo III, sección por definir</w:t>
             </w:r>
           </w:p>
         </w:tc>
@@ -5275,7 +5339,7 @@
                 <w:rFonts w:ascii="Times New Roman" w:hAnsi="Times New Roman"/>
                 <w:sz w:val="18"/>
               </w:rPr>
-              <w:t>4.4</w:t>
+              <w:t>Capítulo posterior de verificación y evaluación, por definir</w:t>
             </w:r>
           </w:p>
         </w:tc>
@@ -5355,7 +5419,7 @@
                 <w:rFonts w:ascii="Times New Roman" w:hAnsi="Times New Roman"/>
                 <w:sz w:val="18"/>
               </w:rPr>
-              <w:t>4.5</w:t>
+              <w:t>Capítulo posterior de verificación y evaluación, por definir</w:t>
             </w:r>
           </w:p>
         </w:tc>
@@ -6175,7 +6239,7 @@
           <w:rFonts w:ascii="Times New Roman" w:hAnsi="Times New Roman"/>
           <w:sz w:val="22"/>
         </w:rPr>
-        <w:t>Figura 4. Diagrama de Gantt, agosto–noviembre de 2026.</w:t>
+        <w:t>Figura 5. Diagrama de Gantt, agosto–noviembre de 2026.</w:t>
       </w:r>
     </w:p>
     <w:p>
@@ -6188,7 +6252,7 @@
         <w:drawing>
           <wp:inline xmlns:a="http://schemas.openxmlformats.org/drawingml/2006/main" xmlns:pic="http://schemas.openxmlformats.org/drawingml/2006/picture">
             <wp:extent cx="5230368" cy="3138221"/>
-            <wp:docPr id="5" name="Picture 5"/>
+            <wp:docPr id="6" name="Picture 6"/>
             <wp:cNvGraphicFramePr>
               <a:graphicFrameLocks noChangeAspect="1"/>
             </wp:cNvGraphicFramePr>
@@ -6200,7 +6264,7 @@
                     <pic:cNvPicPr/>
                   </pic:nvPicPr>
                   <pic:blipFill>
-                    <a:blip r:embed="rId17"/>
+                    <a:blip r:embed="rId18"/>
                     <a:stretch>
                       <a:fillRect/>
                     </a:stretch>
@@ -6228,7 +6292,7 @@
           <w:rFonts w:ascii="Times New Roman" w:hAnsi="Times New Roman"/>
           <w:sz w:val="28"/>
         </w:rPr>
-        <w:t>12. Recursos y presupuesto</w:t>
+        <w:t>12. Recursos</w:t>
       </w:r>
     </w:p>
     <w:p>
@@ -6321,7 +6385,7 @@
           <w:rFonts w:ascii="Times New Roman" w:hAnsi="Times New Roman"/>
           <w:sz w:val="24"/>
         </w:rPr>
-        <w:t>Las horas del postulante y colaboradores se consideran aporte en especie. Se registrarán durante los sprints para documentar el esfuerzo, pero no se monetizan en este presupuesto porque no existe una tarifa institucional definida.</w:t>
+        <w:t>Las horas del postulante y de los colaboradores se registrarán durante los sprints para documentar el esfuerzo dedicado al proyecto.</w:t>
       </w:r>
     </w:p>
     <w:p>
@@ -6459,7 +6523,7 @@
           <w:rFonts w:ascii="Times New Roman" w:hAnsi="Times New Roman"/>
           <w:sz w:val="24"/>
         </w:rPr>
-        <w:t>transporte y alimentación para aproximadamente 20 visitas de campo.</w:t>
+        <w:t>transporte y alimentación para las actividades de campo que se coordinen con R3Foresta.</w:t>
       </w:r>
     </w:p>
     <w:p>
@@ -6468,1266 +6532,23 @@
           <w:rFonts w:ascii="Times New Roman" w:hAnsi="Times New Roman"/>
           <w:sz w:val="24"/>
         </w:rPr>
-        <w:t>No se contempla dominio personalizado: se utilizará el subdominio de Vercel. Tampoco se presupuestan servicios blockchain, IPFS o redes RPC porque se encuentran fuera del alcance.</w:t>
+        <w:t>Se utilizará el subdominio gratuito de Vercel. Los servicios blockchain, IPFS y redes RPC no se consideran recursos del proyecto porque se encuentran fuera del alcance.</w:t>
       </w:r>
     </w:p>
     <w:p>
       <w:pPr>
-        <w:pStyle w:val="Heading2"/>
-      </w:pPr>
-      <w:r>
-        <w:rPr>
-          <w:rFonts w:ascii="Times New Roman" w:hAnsi="Times New Roman"/>
-          <w:sz w:val="24"/>
-        </w:rPr>
-        <w:t>12.3. Presupuesto</w:t>
+        <w:pStyle w:val="Heading1"/>
+      </w:pPr>
+      <w:r>
+        <w:rPr>
+          <w:rFonts w:ascii="Times New Roman" w:hAnsi="Times New Roman"/>
+          <w:sz w:val="28"/>
+        </w:rPr>
+        <w:t>13. Referencias bibliográficas</w:t>
       </w:r>
     </w:p>
     <w:p>
       <w:pPr>
-        <w:pStyle w:val="Caption"/>
-      </w:pPr>
-      <w:r>
-        <w:rPr>
-          <w:rFonts w:ascii="Times New Roman" w:hAnsi="Times New Roman"/>
-          <w:sz w:val="22"/>
-        </w:rPr>
-        <w:t>Tabla 5. Presupuesto monetario previsto.</w:t>
-      </w:r>
-    </w:p>
-    <w:tbl>
-      <w:tblPr>
-        <w:tblW w:type="dxa" w:w="8270"/>
-        <w:jc w:val="center"/>
-        <w:tblLayout w:type="fixed"/>
-        <w:tblLook w:firstColumn="1" w:firstRow="1" w:lastColumn="0" w:lastRow="0" w:noHBand="0" w:noVBand="1" w:val="04A0"/>
-        <w:tblBorders>
-          <w:top w:val="single" w:sz="4" w:color="94A3B8"/>
-          <w:left w:val="single" w:sz="4" w:color="94A3B8"/>
-          <w:bottom w:val="single" w:sz="4" w:color="94A3B8"/>
-          <w:right w:val="single" w:sz="4" w:color="94A3B8"/>
-          <w:insideH w:val="single" w:sz="4" w:color="94A3B8"/>
-          <w:insideV w:val="single" w:sz="4" w:color="94A3B8"/>
-        </w:tblBorders>
-      </w:tblPr>
-      <w:tblGrid>
-        <w:gridCol w:w="2700"/>
-        <w:gridCol w:w="2570"/>
-        <w:gridCol w:w="1500"/>
-        <w:gridCol w:w="1500"/>
-      </w:tblGrid>
-      <w:tr>
-        <w:trPr>
-          <w:tblHeader w:val="true"/>
-        </w:trPr>
-        <w:tc>
-          <w:tcPr>
-            <w:tcW w:type="dxa" w:w="2700"/>
-            <w:vAlign w:val="center"/>
-            <w:tcMar>
-              <w:top w:w="100" w:type="dxa"/>
-              <w:start w:w="110" w:type="dxa"/>
-              <w:bottom w:w="100" w:type="dxa"/>
-              <w:end w:w="110" w:type="dxa"/>
-            </w:tcMar>
-            <w:shd w:fill="DCE6F1"/>
-          </w:tcPr>
-          <w:p>
-            <w:pPr>
-              <w:spacing w:after="0" w:line="240" w:lineRule="auto"/>
-              <w:ind w:firstLine="0" w:left="0" w:right="0"/>
-              <w:jc w:val="left"/>
-            </w:pPr>
-            <w:r>
-              <w:rPr>
-                <w:rFonts w:ascii="Times New Roman" w:hAnsi="Times New Roman"/>
-                <w:b/>
-                <w:sz w:val="18"/>
-              </w:rPr>
-              <w:t>Concepto</w:t>
-            </w:r>
-          </w:p>
-        </w:tc>
-        <w:tc>
-          <w:tcPr>
-            <w:tcW w:type="dxa" w:w="2570"/>
-            <w:vAlign w:val="center"/>
-            <w:tcMar>
-              <w:top w:w="100" w:type="dxa"/>
-              <w:start w:w="110" w:type="dxa"/>
-              <w:bottom w:w="100" w:type="dxa"/>
-              <w:end w:w="110" w:type="dxa"/>
-            </w:tcMar>
-            <w:shd w:fill="DCE6F1"/>
-          </w:tcPr>
-          <w:p>
-            <w:pPr>
-              <w:spacing w:after="0" w:line="240" w:lineRule="auto"/>
-              <w:ind w:firstLine="0" w:left="0" w:right="0"/>
-              <w:jc w:val="right"/>
-            </w:pPr>
-            <w:r>
-              <w:rPr>
-                <w:rFonts w:ascii="Times New Roman" w:hAnsi="Times New Roman"/>
-                <w:b/>
-                <w:sz w:val="18"/>
-              </w:rPr>
-              <w:t>Cálculo</w:t>
-            </w:r>
-          </w:p>
-        </w:tc>
-        <w:tc>
-          <w:tcPr>
-            <w:tcW w:type="dxa" w:w="1500"/>
-            <w:vAlign w:val="center"/>
-            <w:tcMar>
-              <w:top w:w="100" w:type="dxa"/>
-              <w:start w:w="110" w:type="dxa"/>
-              <w:bottom w:w="100" w:type="dxa"/>
-              <w:end w:w="110" w:type="dxa"/>
-            </w:tcMar>
-            <w:shd w:fill="DCE6F1"/>
-          </w:tcPr>
-          <w:p>
-            <w:pPr>
-              <w:spacing w:after="0" w:line="240" w:lineRule="auto"/>
-              <w:ind w:firstLine="0" w:left="0" w:right="0"/>
-              <w:jc w:val="right"/>
-            </w:pPr>
-            <w:r>
-              <w:rPr>
-                <w:rFonts w:ascii="Times New Roman" w:hAnsi="Times New Roman"/>
-                <w:b/>
-                <w:sz w:val="18"/>
-              </w:rPr>
-              <w:t>Moneda</w:t>
-            </w:r>
-          </w:p>
-        </w:tc>
-        <w:tc>
-          <w:tcPr>
-            <w:tcW w:type="dxa" w:w="1500"/>
-            <w:vAlign w:val="center"/>
-            <w:tcMar>
-              <w:top w:w="100" w:type="dxa"/>
-              <w:start w:w="110" w:type="dxa"/>
-              <w:bottom w:w="100" w:type="dxa"/>
-              <w:end w:w="110" w:type="dxa"/>
-            </w:tcMar>
-            <w:shd w:fill="DCE6F1"/>
-          </w:tcPr>
-          <w:p>
-            <w:pPr>
-              <w:spacing w:after="0" w:line="240" w:lineRule="auto"/>
-              <w:ind w:firstLine="0" w:left="0" w:right="0"/>
-              <w:jc w:val="right"/>
-            </w:pPr>
-            <w:r>
-              <w:rPr>
-                <w:rFonts w:ascii="Times New Roman" w:hAnsi="Times New Roman"/>
-                <w:b/>
-                <w:sz w:val="18"/>
-              </w:rPr>
-              <w:t>Subtotal</w:t>
-            </w:r>
-          </w:p>
-        </w:tc>
-      </w:tr>
-      <w:tr>
-        <w:tc>
-          <w:tcPr>
-            <w:tcW w:type="dxa" w:w="2700"/>
-            <w:vAlign w:val="center"/>
-            <w:tcMar>
-              <w:top w:w="100" w:type="dxa"/>
-              <w:start w:w="110" w:type="dxa"/>
-              <w:bottom w:w="100" w:type="dxa"/>
-              <w:end w:w="110" w:type="dxa"/>
-            </w:tcMar>
-          </w:tcPr>
-          <w:p>
-            <w:pPr>
-              <w:spacing w:after="0" w:line="240" w:lineRule="auto"/>
-              <w:ind w:firstLine="0" w:left="0" w:right="0"/>
-              <w:jc w:val="left"/>
-            </w:pPr>
-            <w:r>
-              <w:rPr>
-                <w:rFonts w:ascii="Times New Roman" w:hAnsi="Times New Roman"/>
-                <w:sz w:val="18"/>
-              </w:rPr>
-              <w:t>Agentes de IA: suscripción alternada entre Claude Code y Codex</w:t>
-            </w:r>
-          </w:p>
-        </w:tc>
-        <w:tc>
-          <w:tcPr>
-            <w:tcW w:type="dxa" w:w="2570"/>
-            <w:vAlign w:val="center"/>
-            <w:tcMar>
-              <w:top w:w="100" w:type="dxa"/>
-              <w:start w:w="110" w:type="dxa"/>
-              <w:bottom w:w="100" w:type="dxa"/>
-              <w:end w:w="110" w:type="dxa"/>
-            </w:tcMar>
-          </w:tcPr>
-          <w:p>
-            <w:pPr>
-              <w:spacing w:after="0" w:line="240" w:lineRule="auto"/>
-              <w:ind w:firstLine="0" w:left="0" w:right="0"/>
-              <w:jc w:val="right"/>
-            </w:pPr>
-            <w:r>
-              <w:rPr>
-                <w:rFonts w:ascii="Times New Roman" w:hAnsi="Times New Roman"/>
-                <w:sz w:val="18"/>
-              </w:rPr>
-              <w:t>4 meses × USD 20, agosto–noviembre de 2026</w:t>
-            </w:r>
-          </w:p>
-        </w:tc>
-        <w:tc>
-          <w:tcPr>
-            <w:tcW w:type="dxa" w:w="1500"/>
-            <w:vAlign w:val="center"/>
-            <w:tcMar>
-              <w:top w:w="100" w:type="dxa"/>
-              <w:start w:w="110" w:type="dxa"/>
-              <w:bottom w:w="100" w:type="dxa"/>
-              <w:end w:w="110" w:type="dxa"/>
-            </w:tcMar>
-          </w:tcPr>
-          <w:p>
-            <w:pPr>
-              <w:spacing w:after="0" w:line="240" w:lineRule="auto"/>
-              <w:ind w:firstLine="0" w:left="0" w:right="0"/>
-              <w:jc w:val="right"/>
-            </w:pPr>
-            <w:r>
-              <w:rPr>
-                <w:rFonts w:ascii="Times New Roman" w:hAnsi="Times New Roman"/>
-                <w:sz w:val="18"/>
-              </w:rPr>
-              <w:t>USD</w:t>
-            </w:r>
-          </w:p>
-        </w:tc>
-        <w:tc>
-          <w:tcPr>
-            <w:tcW w:type="dxa" w:w="1500"/>
-            <w:vAlign w:val="center"/>
-            <w:tcMar>
-              <w:top w:w="100" w:type="dxa"/>
-              <w:start w:w="110" w:type="dxa"/>
-              <w:bottom w:w="100" w:type="dxa"/>
-              <w:end w:w="110" w:type="dxa"/>
-            </w:tcMar>
-          </w:tcPr>
-          <w:p>
-            <w:pPr>
-              <w:spacing w:after="0" w:line="240" w:lineRule="auto"/>
-              <w:ind w:firstLine="0" w:left="0" w:right="0"/>
-              <w:jc w:val="right"/>
-            </w:pPr>
-            <w:r>
-              <w:rPr>
-                <w:rFonts w:ascii="Times New Roman" w:hAnsi="Times New Roman"/>
-                <w:sz w:val="18"/>
-              </w:rPr>
-              <w:t>80</w:t>
-            </w:r>
-          </w:p>
-        </w:tc>
-      </w:tr>
-      <w:tr>
-        <w:tc>
-          <w:tcPr>
-            <w:tcW w:type="dxa" w:w="2700"/>
-            <w:vAlign w:val="center"/>
-            <w:tcMar>
-              <w:top w:w="100" w:type="dxa"/>
-              <w:start w:w="110" w:type="dxa"/>
-              <w:bottom w:w="100" w:type="dxa"/>
-              <w:end w:w="110" w:type="dxa"/>
-            </w:tcMar>
-            <w:shd w:fill="F8FAFC"/>
-          </w:tcPr>
-          <w:p>
-            <w:pPr>
-              <w:spacing w:after="0" w:line="240" w:lineRule="auto"/>
-              <w:ind w:firstLine="0" w:left="0" w:right="0"/>
-              <w:jc w:val="left"/>
-            </w:pPr>
-            <w:r>
-              <w:rPr>
-                <w:rFonts w:ascii="Times New Roman" w:hAnsi="Times New Roman"/>
-                <w:sz w:val="18"/>
-              </w:rPr>
-              <w:t>Supabase, Vercel, Render y GitHub</w:t>
-            </w:r>
-          </w:p>
-        </w:tc>
-        <w:tc>
-          <w:tcPr>
-            <w:tcW w:type="dxa" w:w="2570"/>
-            <w:vAlign w:val="center"/>
-            <w:tcMar>
-              <w:top w:w="100" w:type="dxa"/>
-              <w:start w:w="110" w:type="dxa"/>
-              <w:bottom w:w="100" w:type="dxa"/>
-              <w:end w:w="110" w:type="dxa"/>
-            </w:tcMar>
-            <w:shd w:fill="F8FAFC"/>
-          </w:tcPr>
-          <w:p>
-            <w:pPr>
-              <w:spacing w:after="0" w:line="240" w:lineRule="auto"/>
-              <w:ind w:firstLine="0" w:left="0" w:right="0"/>
-              <w:jc w:val="right"/>
-            </w:pPr>
-            <w:r>
-              <w:rPr>
-                <w:rFonts w:ascii="Times New Roman" w:hAnsi="Times New Roman"/>
-                <w:sz w:val="18"/>
-              </w:rPr>
-              <w:t>Planes gratuitos</w:t>
-            </w:r>
-          </w:p>
-        </w:tc>
-        <w:tc>
-          <w:tcPr>
-            <w:tcW w:type="dxa" w:w="1500"/>
-            <w:vAlign w:val="center"/>
-            <w:tcMar>
-              <w:top w:w="100" w:type="dxa"/>
-              <w:start w:w="110" w:type="dxa"/>
-              <w:bottom w:w="100" w:type="dxa"/>
-              <w:end w:w="110" w:type="dxa"/>
-            </w:tcMar>
-            <w:shd w:fill="F8FAFC"/>
-          </w:tcPr>
-          <w:p>
-            <w:pPr>
-              <w:spacing w:after="0" w:line="240" w:lineRule="auto"/>
-              <w:ind w:firstLine="0" w:left="0" w:right="0"/>
-              <w:jc w:val="right"/>
-            </w:pPr>
-            <w:r>
-              <w:rPr>
-                <w:rFonts w:ascii="Times New Roman" w:hAnsi="Times New Roman"/>
-                <w:sz w:val="18"/>
-              </w:rPr>
-              <w:t>USD</w:t>
-            </w:r>
-          </w:p>
-        </w:tc>
-        <w:tc>
-          <w:tcPr>
-            <w:tcW w:type="dxa" w:w="1500"/>
-            <w:vAlign w:val="center"/>
-            <w:tcMar>
-              <w:top w:w="100" w:type="dxa"/>
-              <w:start w:w="110" w:type="dxa"/>
-              <w:bottom w:w="100" w:type="dxa"/>
-              <w:end w:w="110" w:type="dxa"/>
-            </w:tcMar>
-            <w:shd w:fill="F8FAFC"/>
-          </w:tcPr>
-          <w:p>
-            <w:pPr>
-              <w:spacing w:after="0" w:line="240" w:lineRule="auto"/>
-              <w:ind w:firstLine="0" w:left="0" w:right="0"/>
-              <w:jc w:val="right"/>
-            </w:pPr>
-            <w:r>
-              <w:rPr>
-                <w:rFonts w:ascii="Times New Roman" w:hAnsi="Times New Roman"/>
-                <w:sz w:val="18"/>
-              </w:rPr>
-              <w:t>0</w:t>
-            </w:r>
-          </w:p>
-        </w:tc>
-      </w:tr>
-      <w:tr>
-        <w:tc>
-          <w:tcPr>
-            <w:tcW w:type="dxa" w:w="2700"/>
-            <w:vAlign w:val="center"/>
-            <w:tcMar>
-              <w:top w:w="100" w:type="dxa"/>
-              <w:start w:w="110" w:type="dxa"/>
-              <w:bottom w:w="100" w:type="dxa"/>
-              <w:end w:w="110" w:type="dxa"/>
-            </w:tcMar>
-          </w:tcPr>
-          <w:p>
-            <w:pPr>
-              <w:spacing w:after="0" w:line="240" w:lineRule="auto"/>
-              <w:ind w:firstLine="0" w:left="0" w:right="0"/>
-              <w:jc w:val="left"/>
-            </w:pPr>
-            <w:r>
-              <w:rPr>
-                <w:rFonts w:ascii="Times New Roman" w:hAnsi="Times New Roman"/>
-                <w:sz w:val="18"/>
-              </w:rPr>
-              <w:t>Dominio personalizado</w:t>
-            </w:r>
-          </w:p>
-        </w:tc>
-        <w:tc>
-          <w:tcPr>
-            <w:tcW w:type="dxa" w:w="2570"/>
-            <w:vAlign w:val="center"/>
-            <w:tcMar>
-              <w:top w:w="100" w:type="dxa"/>
-              <w:start w:w="110" w:type="dxa"/>
-              <w:bottom w:w="100" w:type="dxa"/>
-              <w:end w:w="110" w:type="dxa"/>
-            </w:tcMar>
-          </w:tcPr>
-          <w:p>
-            <w:pPr>
-              <w:spacing w:after="0" w:line="240" w:lineRule="auto"/>
-              <w:ind w:firstLine="0" w:left="0" w:right="0"/>
-              <w:jc w:val="right"/>
-            </w:pPr>
-            <w:r>
-              <w:rPr>
-                <w:rFonts w:ascii="Times New Roman" w:hAnsi="Times New Roman"/>
-                <w:sz w:val="18"/>
-              </w:rPr>
-              <w:t>No requerido</w:t>
-            </w:r>
-          </w:p>
-        </w:tc>
-        <w:tc>
-          <w:tcPr>
-            <w:tcW w:type="dxa" w:w="1500"/>
-            <w:vAlign w:val="center"/>
-            <w:tcMar>
-              <w:top w:w="100" w:type="dxa"/>
-              <w:start w:w="110" w:type="dxa"/>
-              <w:bottom w:w="100" w:type="dxa"/>
-              <w:end w:w="110" w:type="dxa"/>
-            </w:tcMar>
-          </w:tcPr>
-          <w:p>
-            <w:pPr>
-              <w:spacing w:after="0" w:line="240" w:lineRule="auto"/>
-              <w:ind w:firstLine="0" w:left="0" w:right="0"/>
-              <w:jc w:val="right"/>
-            </w:pPr>
-            <w:r>
-              <w:rPr>
-                <w:rFonts w:ascii="Times New Roman" w:hAnsi="Times New Roman"/>
-                <w:sz w:val="18"/>
-              </w:rPr>
-              <w:t>USD</w:t>
-            </w:r>
-          </w:p>
-        </w:tc>
-        <w:tc>
-          <w:tcPr>
-            <w:tcW w:type="dxa" w:w="1500"/>
-            <w:vAlign w:val="center"/>
-            <w:tcMar>
-              <w:top w:w="100" w:type="dxa"/>
-              <w:start w:w="110" w:type="dxa"/>
-              <w:bottom w:w="100" w:type="dxa"/>
-              <w:end w:w="110" w:type="dxa"/>
-            </w:tcMar>
-          </w:tcPr>
-          <w:p>
-            <w:pPr>
-              <w:spacing w:after="0" w:line="240" w:lineRule="auto"/>
-              <w:ind w:firstLine="0" w:left="0" w:right="0"/>
-              <w:jc w:val="right"/>
-            </w:pPr>
-            <w:r>
-              <w:rPr>
-                <w:rFonts w:ascii="Times New Roman" w:hAnsi="Times New Roman"/>
-                <w:sz w:val="18"/>
-              </w:rPr>
-              <w:t>0</w:t>
-            </w:r>
-          </w:p>
-        </w:tc>
-      </w:tr>
-      <w:tr>
-        <w:tc>
-          <w:tcPr>
-            <w:tcW w:type="dxa" w:w="2700"/>
-            <w:vAlign w:val="center"/>
-            <w:tcMar>
-              <w:top w:w="100" w:type="dxa"/>
-              <w:start w:w="110" w:type="dxa"/>
-              <w:bottom w:w="100" w:type="dxa"/>
-              <w:end w:w="110" w:type="dxa"/>
-            </w:tcMar>
-            <w:shd w:fill="F8FAFC"/>
-          </w:tcPr>
-          <w:p>
-            <w:pPr>
-              <w:spacing w:after="0" w:line="240" w:lineRule="auto"/>
-              <w:ind w:firstLine="0" w:left="0" w:right="0"/>
-              <w:jc w:val="left"/>
-            </w:pPr>
-            <w:r>
-              <w:rPr>
-                <w:rFonts w:ascii="Times New Roman" w:hAnsi="Times New Roman"/>
-                <w:sz w:val="18"/>
-              </w:rPr>
-              <w:t>Transporte de campo</w:t>
-            </w:r>
-          </w:p>
-        </w:tc>
-        <w:tc>
-          <w:tcPr>
-            <w:tcW w:type="dxa" w:w="2570"/>
-            <w:vAlign w:val="center"/>
-            <w:tcMar>
-              <w:top w:w="100" w:type="dxa"/>
-              <w:start w:w="110" w:type="dxa"/>
-              <w:bottom w:w="100" w:type="dxa"/>
-              <w:end w:w="110" w:type="dxa"/>
-            </w:tcMar>
-            <w:shd w:fill="F8FAFC"/>
-          </w:tcPr>
-          <w:p>
-            <w:pPr>
-              <w:spacing w:after="0" w:line="240" w:lineRule="auto"/>
-              <w:ind w:firstLine="0" w:left="0" w:right="0"/>
-              <w:jc w:val="right"/>
-            </w:pPr>
-            <w:r>
-              <w:rPr>
-                <w:rFonts w:ascii="Times New Roman" w:hAnsi="Times New Roman"/>
-                <w:sz w:val="18"/>
-              </w:rPr>
-              <w:t>20 visitas × Bs 20–35</w:t>
-            </w:r>
-          </w:p>
-        </w:tc>
-        <w:tc>
-          <w:tcPr>
-            <w:tcW w:type="dxa" w:w="1500"/>
-            <w:vAlign w:val="center"/>
-            <w:tcMar>
-              <w:top w:w="100" w:type="dxa"/>
-              <w:start w:w="110" w:type="dxa"/>
-              <w:bottom w:w="100" w:type="dxa"/>
-              <w:end w:w="110" w:type="dxa"/>
-            </w:tcMar>
-            <w:shd w:fill="F8FAFC"/>
-          </w:tcPr>
-          <w:p>
-            <w:pPr>
-              <w:spacing w:after="0" w:line="240" w:lineRule="auto"/>
-              <w:ind w:firstLine="0" w:left="0" w:right="0"/>
-              <w:jc w:val="right"/>
-            </w:pPr>
-            <w:r>
-              <w:rPr>
-                <w:rFonts w:ascii="Times New Roman" w:hAnsi="Times New Roman"/>
-                <w:sz w:val="18"/>
-              </w:rPr>
-              <w:t>Bs</w:t>
-            </w:r>
-          </w:p>
-        </w:tc>
-        <w:tc>
-          <w:tcPr>
-            <w:tcW w:type="dxa" w:w="1500"/>
-            <w:vAlign w:val="center"/>
-            <w:tcMar>
-              <w:top w:w="100" w:type="dxa"/>
-              <w:start w:w="110" w:type="dxa"/>
-              <w:bottom w:w="100" w:type="dxa"/>
-              <w:end w:w="110" w:type="dxa"/>
-            </w:tcMar>
-            <w:shd w:fill="F8FAFC"/>
-          </w:tcPr>
-          <w:p>
-            <w:pPr>
-              <w:spacing w:after="0" w:line="240" w:lineRule="auto"/>
-              <w:ind w:firstLine="0" w:left="0" w:right="0"/>
-              <w:jc w:val="right"/>
-            </w:pPr>
-            <w:r>
-              <w:rPr>
-                <w:rFonts w:ascii="Times New Roman" w:hAnsi="Times New Roman"/>
-                <w:sz w:val="18"/>
-              </w:rPr>
-              <w:t>400–700</w:t>
-            </w:r>
-          </w:p>
-        </w:tc>
-      </w:tr>
-      <w:tr>
-        <w:tc>
-          <w:tcPr>
-            <w:tcW w:type="dxa" w:w="2700"/>
-            <w:vAlign w:val="center"/>
-            <w:tcMar>
-              <w:top w:w="100" w:type="dxa"/>
-              <w:start w:w="110" w:type="dxa"/>
-              <w:bottom w:w="100" w:type="dxa"/>
-              <w:end w:w="110" w:type="dxa"/>
-            </w:tcMar>
-          </w:tcPr>
-          <w:p>
-            <w:pPr>
-              <w:spacing w:after="0" w:line="240" w:lineRule="auto"/>
-              <w:ind w:firstLine="0" w:left="0" w:right="0"/>
-              <w:jc w:val="left"/>
-            </w:pPr>
-            <w:r>
-              <w:rPr>
-                <w:rFonts w:ascii="Times New Roman" w:hAnsi="Times New Roman"/>
-                <w:sz w:val="18"/>
-              </w:rPr>
-              <w:t>Alimentación de campo</w:t>
-            </w:r>
-          </w:p>
-        </w:tc>
-        <w:tc>
-          <w:tcPr>
-            <w:tcW w:type="dxa" w:w="2570"/>
-            <w:vAlign w:val="center"/>
-            <w:tcMar>
-              <w:top w:w="100" w:type="dxa"/>
-              <w:start w:w="110" w:type="dxa"/>
-              <w:bottom w:w="100" w:type="dxa"/>
-              <w:end w:w="110" w:type="dxa"/>
-            </w:tcMar>
-          </w:tcPr>
-          <w:p>
-            <w:pPr>
-              <w:spacing w:after="0" w:line="240" w:lineRule="auto"/>
-              <w:ind w:firstLine="0" w:left="0" w:right="0"/>
-              <w:jc w:val="right"/>
-            </w:pPr>
-            <w:r>
-              <w:rPr>
-                <w:rFonts w:ascii="Times New Roman" w:hAnsi="Times New Roman"/>
-                <w:sz w:val="18"/>
-              </w:rPr>
-              <w:t>20 visitas × Bs 20</w:t>
-            </w:r>
-          </w:p>
-        </w:tc>
-        <w:tc>
-          <w:tcPr>
-            <w:tcW w:type="dxa" w:w="1500"/>
-            <w:vAlign w:val="center"/>
-            <w:tcMar>
-              <w:top w:w="100" w:type="dxa"/>
-              <w:start w:w="110" w:type="dxa"/>
-              <w:bottom w:w="100" w:type="dxa"/>
-              <w:end w:w="110" w:type="dxa"/>
-            </w:tcMar>
-          </w:tcPr>
-          <w:p>
-            <w:pPr>
-              <w:spacing w:after="0" w:line="240" w:lineRule="auto"/>
-              <w:ind w:firstLine="0" w:left="0" w:right="0"/>
-              <w:jc w:val="right"/>
-            </w:pPr>
-            <w:r>
-              <w:rPr>
-                <w:rFonts w:ascii="Times New Roman" w:hAnsi="Times New Roman"/>
-                <w:sz w:val="18"/>
-              </w:rPr>
-              <w:t>Bs</w:t>
-            </w:r>
-          </w:p>
-        </w:tc>
-        <w:tc>
-          <w:tcPr>
-            <w:tcW w:type="dxa" w:w="1500"/>
-            <w:vAlign w:val="center"/>
-            <w:tcMar>
-              <w:top w:w="100" w:type="dxa"/>
-              <w:start w:w="110" w:type="dxa"/>
-              <w:bottom w:w="100" w:type="dxa"/>
-              <w:end w:w="110" w:type="dxa"/>
-            </w:tcMar>
-          </w:tcPr>
-          <w:p>
-            <w:pPr>
-              <w:spacing w:after="0" w:line="240" w:lineRule="auto"/>
-              <w:ind w:firstLine="0" w:left="0" w:right="0"/>
-              <w:jc w:val="right"/>
-            </w:pPr>
-            <w:r>
-              <w:rPr>
-                <w:rFonts w:ascii="Times New Roman" w:hAnsi="Times New Roman"/>
-                <w:sz w:val="18"/>
-              </w:rPr>
-              <w:t>400</w:t>
-            </w:r>
-          </w:p>
-        </w:tc>
-      </w:tr>
-      <w:tr>
-        <w:tc>
-          <w:tcPr>
-            <w:tcW w:type="dxa" w:w="2700"/>
-            <w:vAlign w:val="center"/>
-            <w:tcMar>
-              <w:top w:w="100" w:type="dxa"/>
-              <w:start w:w="110" w:type="dxa"/>
-              <w:bottom w:w="100" w:type="dxa"/>
-              <w:end w:w="110" w:type="dxa"/>
-            </w:tcMar>
-            <w:shd w:fill="F8FAFC"/>
-          </w:tcPr>
-          <w:p>
-            <w:pPr>
-              <w:spacing w:after="0" w:line="240" w:lineRule="auto"/>
-              <w:ind w:firstLine="0" w:left="0" w:right="0"/>
-              <w:jc w:val="left"/>
-            </w:pPr>
-            <w:r>
-              <w:rPr>
-                <w:rFonts w:ascii="Times New Roman" w:hAnsi="Times New Roman"/>
-                <w:sz w:val="18"/>
-              </w:rPr>
-              <w:t>Datos móviles</w:t>
-            </w:r>
-          </w:p>
-        </w:tc>
-        <w:tc>
-          <w:tcPr>
-            <w:tcW w:type="dxa" w:w="2570"/>
-            <w:vAlign w:val="center"/>
-            <w:tcMar>
-              <w:top w:w="100" w:type="dxa"/>
-              <w:start w:w="110" w:type="dxa"/>
-              <w:bottom w:w="100" w:type="dxa"/>
-              <w:end w:w="110" w:type="dxa"/>
-            </w:tcMar>
-            <w:shd w:fill="F8FAFC"/>
-          </w:tcPr>
-          <w:p>
-            <w:pPr>
-              <w:spacing w:after="0" w:line="240" w:lineRule="auto"/>
-              <w:ind w:firstLine="0" w:left="0" w:right="0"/>
-              <w:jc w:val="right"/>
-            </w:pPr>
-            <w:r>
-              <w:rPr>
-                <w:rFonts w:ascii="Times New Roman" w:hAnsi="Times New Roman"/>
-                <w:sz w:val="18"/>
-              </w:rPr>
-              <w:t>20 visitas × Bs 3</w:t>
-            </w:r>
-          </w:p>
-        </w:tc>
-        <w:tc>
-          <w:tcPr>
-            <w:tcW w:type="dxa" w:w="1500"/>
-            <w:vAlign w:val="center"/>
-            <w:tcMar>
-              <w:top w:w="100" w:type="dxa"/>
-              <w:start w:w="110" w:type="dxa"/>
-              <w:bottom w:w="100" w:type="dxa"/>
-              <w:end w:w="110" w:type="dxa"/>
-            </w:tcMar>
-            <w:shd w:fill="F8FAFC"/>
-          </w:tcPr>
-          <w:p>
-            <w:pPr>
-              <w:spacing w:after="0" w:line="240" w:lineRule="auto"/>
-              <w:ind w:firstLine="0" w:left="0" w:right="0"/>
-              <w:jc w:val="right"/>
-            </w:pPr>
-            <w:r>
-              <w:rPr>
-                <w:rFonts w:ascii="Times New Roman" w:hAnsi="Times New Roman"/>
-                <w:sz w:val="18"/>
-              </w:rPr>
-              <w:t>Bs</w:t>
-            </w:r>
-          </w:p>
-        </w:tc>
-        <w:tc>
-          <w:tcPr>
-            <w:tcW w:type="dxa" w:w="1500"/>
-            <w:vAlign w:val="center"/>
-            <w:tcMar>
-              <w:top w:w="100" w:type="dxa"/>
-              <w:start w:w="110" w:type="dxa"/>
-              <w:bottom w:w="100" w:type="dxa"/>
-              <w:end w:w="110" w:type="dxa"/>
-            </w:tcMar>
-            <w:shd w:fill="F8FAFC"/>
-          </w:tcPr>
-          <w:p>
-            <w:pPr>
-              <w:spacing w:after="0" w:line="240" w:lineRule="auto"/>
-              <w:ind w:firstLine="0" w:left="0" w:right="0"/>
-              <w:jc w:val="right"/>
-            </w:pPr>
-            <w:r>
-              <w:rPr>
-                <w:rFonts w:ascii="Times New Roman" w:hAnsi="Times New Roman"/>
-                <w:sz w:val="18"/>
-              </w:rPr>
-              <w:t>60</w:t>
-            </w:r>
-          </w:p>
-        </w:tc>
-      </w:tr>
-      <w:tr>
-        <w:tc>
-          <w:tcPr>
-            <w:tcW w:type="dxa" w:w="2700"/>
-            <w:vAlign w:val="center"/>
-            <w:tcMar>
-              <w:top w:w="100" w:type="dxa"/>
-              <w:start w:w="110" w:type="dxa"/>
-              <w:bottom w:w="100" w:type="dxa"/>
-              <w:end w:w="110" w:type="dxa"/>
-            </w:tcMar>
-          </w:tcPr>
-          <w:p>
-            <w:pPr>
-              <w:spacing w:after="0" w:line="240" w:lineRule="auto"/>
-              <w:ind w:firstLine="0" w:left="0" w:right="0"/>
-              <w:jc w:val="left"/>
-            </w:pPr>
-            <w:r>
-              <w:rPr>
-                <w:rFonts w:ascii="Times New Roman" w:hAnsi="Times New Roman"/>
-                <w:sz w:val="18"/>
-              </w:rPr>
-              <w:t>Internet, agosto–noviembre</w:t>
-            </w:r>
-          </w:p>
-        </w:tc>
-        <w:tc>
-          <w:tcPr>
-            <w:tcW w:type="dxa" w:w="2570"/>
-            <w:vAlign w:val="center"/>
-            <w:tcMar>
-              <w:top w:w="100" w:type="dxa"/>
-              <w:start w:w="110" w:type="dxa"/>
-              <w:bottom w:w="100" w:type="dxa"/>
-              <w:end w:w="110" w:type="dxa"/>
-            </w:tcMar>
-          </w:tcPr>
-          <w:p>
-            <w:pPr>
-              <w:spacing w:after="0" w:line="240" w:lineRule="auto"/>
-              <w:ind w:firstLine="0" w:left="0" w:right="0"/>
-              <w:jc w:val="right"/>
-            </w:pPr>
-            <w:r>
-              <w:rPr>
-                <w:rFonts w:ascii="Times New Roman" w:hAnsi="Times New Roman"/>
-                <w:sz w:val="18"/>
-              </w:rPr>
-              <w:t>4 meses × Bs 50</w:t>
-            </w:r>
-          </w:p>
-        </w:tc>
-        <w:tc>
-          <w:tcPr>
-            <w:tcW w:type="dxa" w:w="1500"/>
-            <w:vAlign w:val="center"/>
-            <w:tcMar>
-              <w:top w:w="100" w:type="dxa"/>
-              <w:start w:w="110" w:type="dxa"/>
-              <w:bottom w:w="100" w:type="dxa"/>
-              <w:end w:w="110" w:type="dxa"/>
-            </w:tcMar>
-          </w:tcPr>
-          <w:p>
-            <w:pPr>
-              <w:spacing w:after="0" w:line="240" w:lineRule="auto"/>
-              <w:ind w:firstLine="0" w:left="0" w:right="0"/>
-              <w:jc w:val="right"/>
-            </w:pPr>
-            <w:r>
-              <w:rPr>
-                <w:rFonts w:ascii="Times New Roman" w:hAnsi="Times New Roman"/>
-                <w:sz w:val="18"/>
-              </w:rPr>
-              <w:t>Bs</w:t>
-            </w:r>
-          </w:p>
-        </w:tc>
-        <w:tc>
-          <w:tcPr>
-            <w:tcW w:type="dxa" w:w="1500"/>
-            <w:vAlign w:val="center"/>
-            <w:tcMar>
-              <w:top w:w="100" w:type="dxa"/>
-              <w:start w:w="110" w:type="dxa"/>
-              <w:bottom w:w="100" w:type="dxa"/>
-              <w:end w:w="110" w:type="dxa"/>
-            </w:tcMar>
-          </w:tcPr>
-          <w:p>
-            <w:pPr>
-              <w:spacing w:after="0" w:line="240" w:lineRule="auto"/>
-              <w:ind w:firstLine="0" w:left="0" w:right="0"/>
-              <w:jc w:val="right"/>
-            </w:pPr>
-            <w:r>
-              <w:rPr>
-                <w:rFonts w:ascii="Times New Roman" w:hAnsi="Times New Roman"/>
-                <w:sz w:val="18"/>
-              </w:rPr>
-              <w:t>200</w:t>
-            </w:r>
-          </w:p>
-        </w:tc>
-      </w:tr>
-      <w:tr>
-        <w:tc>
-          <w:tcPr>
-            <w:tcW w:type="dxa" w:w="2700"/>
-            <w:vAlign w:val="center"/>
-            <w:tcMar>
-              <w:top w:w="100" w:type="dxa"/>
-              <w:start w:w="110" w:type="dxa"/>
-              <w:bottom w:w="100" w:type="dxa"/>
-              <w:end w:w="110" w:type="dxa"/>
-            </w:tcMar>
-            <w:shd w:fill="F8FAFC"/>
-          </w:tcPr>
-          <w:p>
-            <w:pPr>
-              <w:spacing w:after="0" w:line="240" w:lineRule="auto"/>
-              <w:ind w:firstLine="0" w:left="0" w:right="0"/>
-              <w:jc w:val="left"/>
-            </w:pPr>
-            <w:r>
-              <w:rPr>
-                <w:rFonts w:ascii="Times New Roman" w:hAnsi="Times New Roman"/>
-                <w:sz w:val="18"/>
-              </w:rPr>
-              <w:t>Equipos y horas de trabajo</w:t>
-            </w:r>
-          </w:p>
-        </w:tc>
-        <w:tc>
-          <w:tcPr>
-            <w:tcW w:type="dxa" w:w="2570"/>
-            <w:vAlign w:val="center"/>
-            <w:tcMar>
-              <w:top w:w="100" w:type="dxa"/>
-              <w:start w:w="110" w:type="dxa"/>
-              <w:bottom w:w="100" w:type="dxa"/>
-              <w:end w:w="110" w:type="dxa"/>
-            </w:tcMar>
-            <w:shd w:fill="F8FAFC"/>
-          </w:tcPr>
-          <w:p>
-            <w:pPr>
-              <w:spacing w:after="0" w:line="240" w:lineRule="auto"/>
-              <w:ind w:firstLine="0" w:left="0" w:right="0"/>
-              <w:jc w:val="right"/>
-            </w:pPr>
-            <w:r>
-              <w:rPr>
-                <w:rFonts w:ascii="Times New Roman" w:hAnsi="Times New Roman"/>
-                <w:sz w:val="18"/>
-              </w:rPr>
-              <w:t>Aporte en especie, no monetizado</w:t>
-            </w:r>
-          </w:p>
-        </w:tc>
-        <w:tc>
-          <w:tcPr>
-            <w:tcW w:type="dxa" w:w="1500"/>
-            <w:vAlign w:val="center"/>
-            <w:tcMar>
-              <w:top w:w="100" w:type="dxa"/>
-              <w:start w:w="110" w:type="dxa"/>
-              <w:bottom w:w="100" w:type="dxa"/>
-              <w:end w:w="110" w:type="dxa"/>
-            </w:tcMar>
-            <w:shd w:fill="F8FAFC"/>
-          </w:tcPr>
-          <w:p>
-            <w:pPr>
-              <w:spacing w:after="0" w:line="240" w:lineRule="auto"/>
-              <w:ind w:firstLine="0" w:left="0" w:right="0"/>
-              <w:jc w:val="right"/>
-            </w:pPr>
-            <w:r>
-              <w:rPr>
-                <w:rFonts w:ascii="Times New Roman" w:hAnsi="Times New Roman"/>
-                <w:sz w:val="18"/>
-              </w:rPr>
-              <w:t>—</w:t>
-            </w:r>
-          </w:p>
-        </w:tc>
-        <w:tc>
-          <w:tcPr>
-            <w:tcW w:type="dxa" w:w="1500"/>
-            <w:vAlign w:val="center"/>
-            <w:tcMar>
-              <w:top w:w="100" w:type="dxa"/>
-              <w:start w:w="110" w:type="dxa"/>
-              <w:bottom w:w="100" w:type="dxa"/>
-              <w:end w:w="110" w:type="dxa"/>
-            </w:tcMar>
-            <w:shd w:fill="F8FAFC"/>
-          </w:tcPr>
-          <w:p>
-            <w:pPr>
-              <w:spacing w:after="0" w:line="240" w:lineRule="auto"/>
-              <w:ind w:firstLine="0" w:left="0" w:right="0"/>
-              <w:jc w:val="right"/>
-            </w:pPr>
-            <w:r>
-              <w:rPr>
-                <w:rFonts w:ascii="Times New Roman" w:hAnsi="Times New Roman"/>
-                <w:sz w:val="18"/>
-              </w:rPr>
-              <w:t>—</w:t>
-            </w:r>
-          </w:p>
-        </w:tc>
-      </w:tr>
-      <w:tr>
-        <w:tc>
-          <w:tcPr>
-            <w:tcW w:type="dxa" w:w="2700"/>
-            <w:vAlign w:val="center"/>
-            <w:tcMar>
-              <w:top w:w="100" w:type="dxa"/>
-              <w:start w:w="110" w:type="dxa"/>
-              <w:bottom w:w="100" w:type="dxa"/>
-              <w:end w:w="110" w:type="dxa"/>
-            </w:tcMar>
-          </w:tcPr>
-          <w:p>
-            <w:pPr>
-              <w:spacing w:after="0" w:line="240" w:lineRule="auto"/>
-              <w:ind w:firstLine="0" w:left="0" w:right="0"/>
-              <w:jc w:val="left"/>
-            </w:pPr>
-            <w:r>
-              <w:rPr>
-                <w:rFonts w:ascii="Times New Roman" w:hAnsi="Times New Roman"/>
-                <w:sz w:val="18"/>
-              </w:rPr>
-              <w:t>Total en dólares</w:t>
-            </w:r>
-          </w:p>
-        </w:tc>
-        <w:tc>
-          <w:tcPr>
-            <w:tcW w:type="dxa" w:w="2570"/>
-            <w:vAlign w:val="center"/>
-            <w:tcMar>
-              <w:top w:w="100" w:type="dxa"/>
-              <w:start w:w="110" w:type="dxa"/>
-              <w:bottom w:w="100" w:type="dxa"/>
-              <w:end w:w="110" w:type="dxa"/>
-            </w:tcMar>
-          </w:tcPr>
-          <w:p>
-            <w:pPr>
-              <w:spacing w:after="0" w:line="240" w:lineRule="auto"/>
-              <w:ind w:firstLine="0" w:left="0" w:right="0"/>
-              <w:jc w:val="right"/>
-            </w:pPr>
-          </w:p>
-        </w:tc>
-        <w:tc>
-          <w:tcPr>
-            <w:tcW w:type="dxa" w:w="1500"/>
-            <w:vAlign w:val="center"/>
-            <w:tcMar>
-              <w:top w:w="100" w:type="dxa"/>
-              <w:start w:w="110" w:type="dxa"/>
-              <w:bottom w:w="100" w:type="dxa"/>
-              <w:end w:w="110" w:type="dxa"/>
-            </w:tcMar>
-          </w:tcPr>
-          <w:p>
-            <w:pPr>
-              <w:spacing w:after="0" w:line="240" w:lineRule="auto"/>
-              <w:ind w:firstLine="0" w:left="0" w:right="0"/>
-              <w:jc w:val="right"/>
-            </w:pPr>
-            <w:r>
-              <w:rPr>
-                <w:rFonts w:ascii="Times New Roman" w:hAnsi="Times New Roman"/>
-                <w:sz w:val="18"/>
-              </w:rPr>
-              <w:t>USD</w:t>
-            </w:r>
-          </w:p>
-        </w:tc>
-        <w:tc>
-          <w:tcPr>
-            <w:tcW w:type="dxa" w:w="1500"/>
-            <w:vAlign w:val="center"/>
-            <w:tcMar>
-              <w:top w:w="100" w:type="dxa"/>
-              <w:start w:w="110" w:type="dxa"/>
-              <w:bottom w:w="100" w:type="dxa"/>
-              <w:end w:w="110" w:type="dxa"/>
-            </w:tcMar>
-          </w:tcPr>
-          <w:p>
-            <w:pPr>
-              <w:spacing w:after="0" w:line="240" w:lineRule="auto"/>
-              <w:ind w:firstLine="0" w:left="0" w:right="0"/>
-              <w:jc w:val="right"/>
-            </w:pPr>
-            <w:r>
-              <w:rPr>
-                <w:rFonts w:ascii="Times New Roman" w:hAnsi="Times New Roman"/>
-                <w:sz w:val="18"/>
-              </w:rPr>
-              <w:t>80</w:t>
-            </w:r>
-          </w:p>
-        </w:tc>
-      </w:tr>
-      <w:tr>
-        <w:tc>
-          <w:tcPr>
-            <w:tcW w:type="dxa" w:w="2700"/>
-            <w:vAlign w:val="center"/>
-            <w:tcMar>
-              <w:top w:w="100" w:type="dxa"/>
-              <w:start w:w="110" w:type="dxa"/>
-              <w:bottom w:w="100" w:type="dxa"/>
-              <w:end w:w="110" w:type="dxa"/>
-            </w:tcMar>
-            <w:shd w:fill="F8FAFC"/>
-          </w:tcPr>
-          <w:p>
-            <w:pPr>
-              <w:spacing w:after="0" w:line="240" w:lineRule="auto"/>
-              <w:ind w:firstLine="0" w:left="0" w:right="0"/>
-              <w:jc w:val="left"/>
-            </w:pPr>
-            <w:r>
-              <w:rPr>
-                <w:rFonts w:ascii="Times New Roman" w:hAnsi="Times New Roman"/>
-                <w:sz w:val="18"/>
-              </w:rPr>
-              <w:t>Total en bolivianos</w:t>
-            </w:r>
-          </w:p>
-        </w:tc>
-        <w:tc>
-          <w:tcPr>
-            <w:tcW w:type="dxa" w:w="2570"/>
-            <w:vAlign w:val="center"/>
-            <w:tcMar>
-              <w:top w:w="100" w:type="dxa"/>
-              <w:start w:w="110" w:type="dxa"/>
-              <w:bottom w:w="100" w:type="dxa"/>
-              <w:end w:w="110" w:type="dxa"/>
-            </w:tcMar>
-            <w:shd w:fill="F8FAFC"/>
-          </w:tcPr>
-          <w:p>
-            <w:pPr>
-              <w:spacing w:after="0" w:line="240" w:lineRule="auto"/>
-              <w:ind w:firstLine="0" w:left="0" w:right="0"/>
-              <w:jc w:val="right"/>
-            </w:pPr>
-          </w:p>
-        </w:tc>
-        <w:tc>
-          <w:tcPr>
-            <w:tcW w:type="dxa" w:w="1500"/>
-            <w:vAlign w:val="center"/>
-            <w:tcMar>
-              <w:top w:w="100" w:type="dxa"/>
-              <w:start w:w="110" w:type="dxa"/>
-              <w:bottom w:w="100" w:type="dxa"/>
-              <w:end w:w="110" w:type="dxa"/>
-            </w:tcMar>
-            <w:shd w:fill="F8FAFC"/>
-          </w:tcPr>
-          <w:p>
-            <w:pPr>
-              <w:spacing w:after="0" w:line="240" w:lineRule="auto"/>
-              <w:ind w:firstLine="0" w:left="0" w:right="0"/>
-              <w:jc w:val="right"/>
-            </w:pPr>
-            <w:r>
-              <w:rPr>
-                <w:rFonts w:ascii="Times New Roman" w:hAnsi="Times New Roman"/>
-                <w:sz w:val="18"/>
-              </w:rPr>
-              <w:t>Bs</w:t>
-            </w:r>
-          </w:p>
-        </w:tc>
-        <w:tc>
-          <w:tcPr>
-            <w:tcW w:type="dxa" w:w="1500"/>
-            <w:vAlign w:val="center"/>
-            <w:tcMar>
-              <w:top w:w="100" w:type="dxa"/>
-              <w:start w:w="110" w:type="dxa"/>
-              <w:bottom w:w="100" w:type="dxa"/>
-              <w:end w:w="110" w:type="dxa"/>
-            </w:tcMar>
-            <w:shd w:fill="F8FAFC"/>
-          </w:tcPr>
-          <w:p>
-            <w:pPr>
-              <w:spacing w:after="0" w:line="240" w:lineRule="auto"/>
-              <w:ind w:firstLine="0" w:left="0" w:right="0"/>
-              <w:jc w:val="right"/>
-            </w:pPr>
-            <w:r>
-              <w:rPr>
-                <w:rFonts w:ascii="Times New Roman" w:hAnsi="Times New Roman"/>
-                <w:sz w:val="18"/>
-              </w:rPr>
-              <w:t>1.060–1.360</w:t>
-            </w:r>
-          </w:p>
-        </w:tc>
-      </w:tr>
-    </w:tbl>
-    <w:p>
-      <w:pPr>
-        <w:spacing w:after="0"/>
-      </w:pPr>
-    </w:p>
-    <w:p>
-      <w:r>
-        <w:rPr>
-          <w:rFonts w:ascii="Times New Roman" w:hAnsi="Times New Roman"/>
-          <w:sz w:val="24"/>
-        </w:rPr>
-        <w:t>El postulante financiará el 100 % de los desembolsos monetarios. R3Foresta aportará acceso al contexto operativo y participación, sin aporte económico comprometido. El presupuesto corresponde exclusivamente a la ejecución formal agosto–noviembre; los gastos exploratorios anteriores se consideran costos hundidos y no se imputan al Proyecto de Grado. Los costos se presentan en sus monedas originales para evitar una conversión sujeta a variaciones. La impresión no se incluye porque la entrega actual es digital y la cantidad de copias físicas todavía no está definida.</w:t>
-      </w:r>
-    </w:p>
-    <w:p>
-      <w:pPr>
-        <w:pStyle w:val="Heading1"/>
-      </w:pPr>
-      <w:r>
-        <w:rPr>
-          <w:rFonts w:ascii="Times New Roman" w:hAnsi="Times New Roman"/>
-          <w:sz w:val="28"/>
-        </w:rPr>
-        <w:t>13. Referencias bibliográficas</w:t>
-      </w:r>
-    </w:p>
-    <w:p>
-      <w:pPr>
         <w:spacing w:line="360" w:lineRule="auto" w:after="80"/>
         <w:ind w:hanging="720" w:left="720"/>
       </w:pPr>
@@ -7753,7 +6574,7 @@
         </w:rPr>
         <w:t xml:space="preserve">(4), 390–396. </w:t>
       </w:r>
-      <w:hyperlink r:id="rId18">
+      <w:hyperlink r:id="rId19">
         <w:r>
           <w:rPr>
             <w:rFonts w:ascii="Times New Roman" w:hAnsi="Times New Roman"/>
@@ -7792,7 +6613,7 @@
         </w:rPr>
         <w:t xml:space="preserve">. </w:t>
       </w:r>
-      <w:hyperlink r:id="rId19">
+      <w:hyperlink r:id="rId20">
         <w:r>
           <w:rPr>
             <w:rFonts w:ascii="Times New Roman" w:hAnsi="Times New Roman"/>
@@ -7831,7 +6652,7 @@
         </w:rPr>
         <w:t xml:space="preserve">, 65–80. </w:t>
       </w:r>
-      <w:hyperlink r:id="rId20">
+      <w:hyperlink r:id="rId21">
         <w:r>
           <w:rPr>
             <w:rFonts w:ascii="Times New Roman" w:hAnsi="Times New Roman"/>
@@ -7870,7 +6691,7 @@
         </w:rPr>
         <w:t xml:space="preserve">(7), 1016–1031. </w:t>
       </w:r>
-      <w:hyperlink r:id="rId21">
+      <w:hyperlink r:id="rId22">
         <w:r>
           <w:rPr>
             <w:rFonts w:ascii="Times New Roman" w:hAnsi="Times New Roman"/>
@@ -7909,7 +6730,7 @@
         </w:rPr>
         <w:t xml:space="preserve">. Sustainable Forest Management Toolbox. Recuperado el 19 de agosto de 2026, de </w:t>
       </w:r>
-      <w:hyperlink r:id="rId22">
+      <w:hyperlink r:id="rId23">
         <w:r>
           <w:rPr>
             <w:rFonts w:ascii="Times New Roman" w:hAnsi="Times New Roman"/>
@@ -7948,7 +6769,7 @@
         </w:rPr>
         <w:t xml:space="preserve">, 94–101. </w:t>
       </w:r>
-      <w:hyperlink r:id="rId23">
+      <w:hyperlink r:id="rId24">
         <w:r>
           <w:rPr>
             <w:rFonts w:ascii="Times New Roman" w:hAnsi="Times New Roman"/>
@@ -7987,7 +6808,7 @@
         </w:rPr>
         <w:t xml:space="preserve">(4), 287–317. </w:t>
       </w:r>
-      <w:hyperlink r:id="rId24">
+      <w:hyperlink r:id="rId25">
         <w:r>
           <w:rPr>
             <w:rFonts w:ascii="Times New Roman" w:hAnsi="Times New Roman"/>
@@ -8026,7 +6847,7 @@
         </w:rPr>
         <w:t xml:space="preserve">(1), 75–105. </w:t>
       </w:r>
-      <w:hyperlink r:id="rId25">
+      <w:hyperlink r:id="rId26">
         <w:r>
           <w:rPr>
             <w:rFonts w:ascii="Times New Roman" w:hAnsi="Times New Roman"/>
@@ -8065,7 +6886,7 @@
         </w:rPr>
         <w:t xml:space="preserve">. </w:t>
       </w:r>
-      <w:hyperlink r:id="rId26">
+      <w:hyperlink r:id="rId27">
         <w:r>
           <w:rPr>
             <w:rFonts w:ascii="Times New Roman" w:hAnsi="Times New Roman"/>
@@ -8104,7 +6925,7 @@
         </w:rPr>
         <w:t xml:space="preserve"> (ISO Standard No. 22095:2020). </w:t>
       </w:r>
-      <w:hyperlink r:id="rId27">
+      <w:hyperlink r:id="rId28">
         <w:r>
           <w:rPr>
             <w:rFonts w:ascii="Times New Roman" w:hAnsi="Times New Roman"/>
@@ -8143,7 +6964,7 @@
         </w:rPr>
         <w:t xml:space="preserve"> (ISO/IEC Standard No. 25010:2023). </w:t>
       </w:r>
-      <w:hyperlink r:id="rId28">
+      <w:hyperlink r:id="rId29">
         <w:r>
           <w:rPr>
             <w:rFonts w:ascii="Times New Roman" w:hAnsi="Times New Roman"/>
@@ -8182,7 +7003,7 @@
         </w:rPr>
         <w:t xml:space="preserve"> (ISO/IEC/IEEE Standard No. 12207:2026). </w:t>
       </w:r>
-      <w:hyperlink r:id="rId29">
+      <w:hyperlink r:id="rId30">
         <w:r>
           <w:rPr>
             <w:rFonts w:ascii="Times New Roman" w:hAnsi="Times New Roman"/>
@@ -8221,7 +7042,7 @@
         </w:rPr>
         <w:t xml:space="preserve">(6), 47–56. </w:t>
       </w:r>
-      <w:hyperlink r:id="rId30">
+      <w:hyperlink r:id="rId31">
         <w:r>
           <w:rPr>
             <w:rFonts w:ascii="Times New Roman" w:hAnsi="Times New Roman"/>
@@ -8260,7 +7081,7 @@
         </w:rPr>
         <w:t xml:space="preserve"> [Proyecto de grado, Universidad Pública de El Alto]. </w:t>
       </w:r>
-      <w:hyperlink r:id="rId31">
+      <w:hyperlink r:id="rId32">
         <w:r>
           <w:rPr>
             <w:rFonts w:ascii="Times New Roman" w:hAnsi="Times New Roman"/>
@@ -8299,7 +7120,7 @@
         </w:rPr>
         <w:t xml:space="preserve">(16), 200–213. </w:t>
       </w:r>
-      <w:hyperlink r:id="rId32">
+      <w:hyperlink r:id="rId33">
         <w:r>
           <w:rPr>
             <w:rFonts w:ascii="Times New Roman" w:hAnsi="Times New Roman"/>
@@ -8338,7 +7159,7 @@
         </w:rPr>
         <w:t xml:space="preserve">(10), 40–51. </w:t>
       </w:r>
-      <w:hyperlink r:id="rId33">
+      <w:hyperlink r:id="rId34">
         <w:r>
           <w:rPr>
             <w:rFonts w:ascii="Times New Roman" w:hAnsi="Times New Roman"/>
@@ -8377,7 +7198,7 @@
         </w:rPr>
         <w:t xml:space="preserve">(5), 211–214. </w:t>
       </w:r>
-      <w:hyperlink r:id="rId34">
+      <w:hyperlink r:id="rId35">
         <w:r>
           <w:rPr>
             <w:rFonts w:ascii="Times New Roman" w:hAnsi="Times New Roman"/>
@@ -8423,7 +7244,7 @@
         </w:rPr>
         <w:t xml:space="preserve">(2), 142–150. </w:t>
       </w:r>
-      <w:hyperlink r:id="rId35">
+      <w:hyperlink r:id="rId36">
         <w:r>
           <w:rPr>
             <w:rFonts w:ascii="Times New Roman" w:hAnsi="Times New Roman"/>
@@ -8462,7 +7283,7 @@
         </w:rPr>
         <w:t xml:space="preserve">, 143–149. </w:t>
       </w:r>
-      <w:hyperlink r:id="rId36">
+      <w:hyperlink r:id="rId37">
         <w:r>
           <w:rPr>
             <w:rFonts w:ascii="Times New Roman" w:hAnsi="Times New Roman"/>
@@ -8501,7 +7322,7 @@
         </w:rPr>
         <w:t xml:space="preserve">(3), 45–77. </w:t>
       </w:r>
-      <w:hyperlink r:id="rId37">
+      <w:hyperlink r:id="rId38">
         <w:r>
           <w:rPr>
             <w:rFonts w:ascii="Times New Roman" w:hAnsi="Times New Roman"/>
@@ -8523,7 +7344,7 @@
           <w:rFonts w:ascii="Times New Roman" w:hAnsi="Times New Roman"/>
           <w:sz w:val="24"/>
         </w:rPr>
-        <w:t xml:space="preserve">Runeson, P., &amp; Höst, M. (2009). Guidelines for conducting and reporting case study research in software engineering. </w:t>
+        <w:t xml:space="preserve">R3Foresta. (2026, 23 de agosto). </w:t>
       </w:r>
       <w:r>
         <w:rPr>
@@ -8531,6 +7352,34 @@
           <w:i/>
           <w:sz w:val="24"/>
         </w:rPr>
+        <w:t>Resumen Ejecutivo Institucional: Modelo Integral de Bioregeneración, Innovación Ambiental y Desarrollo Comunitario</w:t>
+      </w:r>
+      <w:r>
+        <w:rPr>
+          <w:rFonts w:ascii="Times New Roman" w:hAnsi="Times New Roman"/>
+          <w:sz w:val="24"/>
+        </w:rPr>
+        <w:t xml:space="preserve"> [Documento institucional no publicado].</w:t>
+      </w:r>
+    </w:p>
+    <w:p>
+      <w:pPr>
+        <w:spacing w:line="360" w:lineRule="auto" w:after="80"/>
+        <w:ind w:hanging="720" w:left="720"/>
+      </w:pPr>
+      <w:r>
+        <w:rPr>
+          <w:rFonts w:ascii="Times New Roman" w:hAnsi="Times New Roman"/>
+          <w:sz w:val="24"/>
+        </w:rPr>
+        <w:t xml:space="preserve">Runeson, P., &amp; Höst, M. (2009). Guidelines for conducting and reporting case study research in software engineering. </w:t>
+      </w:r>
+      <w:r>
+        <w:rPr>
+          <w:rFonts w:ascii="Times New Roman" w:hAnsi="Times New Roman"/>
+          <w:i/>
+          <w:sz w:val="24"/>
+        </w:rPr>
         <w:t>Empirical Software Engineering, 14</w:t>
       </w:r>
       <w:r>
@@ -8540,7 +7389,7 @@
         </w:rPr>
         <w:t xml:space="preserve">, 131–164. </w:t>
       </w:r>
-      <w:hyperlink r:id="rId38">
+      <w:hyperlink r:id="rId39">
         <w:r>
           <w:rPr>
             <w:rFonts w:ascii="Times New Roman" w:hAnsi="Times New Roman"/>
@@ -8579,7 +7428,7 @@
         </w:rPr>
         <w:t xml:space="preserve"> [Tesis, Universidad Privada de Tacna]. </w:t>
       </w:r>
-      <w:hyperlink r:id="rId39">
+      <w:hyperlink r:id="rId40">
         <w:r>
           <w:rPr>
             <w:rFonts w:ascii="Times New Roman" w:hAnsi="Times New Roman"/>
@@ -8618,7 +7467,7 @@
         </w:rPr>
         <w:t xml:space="preserve"> (Lecture Notes in Business Information Processing, Vol. 188, pp. 46–57). Springer. </w:t>
       </w:r>
-      <w:hyperlink r:id="rId40">
+      <w:hyperlink r:id="rId41">
         <w:r>
           <w:rPr>
             <w:rFonts w:ascii="Times New Roman" w:hAnsi="Times New Roman"/>
@@ -8657,7 +7506,7 @@
         </w:rPr>
         <w:t xml:space="preserve">(4), 417–433. </w:t>
       </w:r>
-      <w:hyperlink r:id="rId41">
+      <w:hyperlink r:id="rId42">
         <w:r>
           <w:rPr>
             <w:rFonts w:ascii="Times New Roman" w:hAnsi="Times New Roman"/>
@@ -8696,7 +7545,7 @@
         </w:rPr>
         <w:t xml:space="preserve">. </w:t>
       </w:r>
-      <w:hyperlink r:id="rId42">
+      <w:hyperlink r:id="rId43">
         <w:r>
           <w:rPr>
             <w:rFonts w:ascii="Times New Roman" w:hAnsi="Times New Roman"/>
@@ -9547,7 +8396,7 @@
     <w:pPr>
       <w:keepNext/>
       <w:keepLines/>
-      <w:pageBreakBefore/>
+      <w:pageBreakBefore w:val="0"/>
       <w:spacing w:before="240" w:after="120" w:line="276" w:lineRule="auto"/>
       <w:ind w:firstLine="0"/>
       <w:outlineLvl w:val="0"/>

</xml_diff>